<commit_message>
worked but need alignment
</commit_message>
<xml_diff>
--- a/public/contract.docx
+++ b/public/contract.docx
@@ -456,23 +456,32 @@
       <w:pPr>
         <w:bidi w:val="0"/>
         <w:spacing w:after="0"/>
-        <w:ind w:left="113"/>
+        <w:ind w:right="77"/>
+      </w:pPr>
+      <w:r>
+        <w:rPr>
+          <w:rFonts w:ascii="Arial" w:eastAsia="Arial" w:hAnsi="Arial" w:cs="Arial"/>
+          <w:sz w:val="28"/>
+        </w:rPr>
+        <w:t xml:space="preserve"> </w:t>
+      </w:r>
+    </w:p>
+    <w:p>
+      <w:pPr>
+        <w:spacing w:after="0"/>
+        <w:ind w:left="-3" w:hanging="10"/>
         <w:jc w:val="left"/>
       </w:pPr>
       <w:r>
         <w:rPr>
           <w:rFonts w:ascii="Arial" w:eastAsia="Arial" w:hAnsi="Arial" w:cs="Arial"/>
-          <w:sz w:val="28"/>
-        </w:rPr>
-        <w:t xml:space="preserve"> </w:t>
-      </w:r>
-      <w:r>
-        <w:rPr>
-          <w:rFonts w:ascii="Arial" w:eastAsia="Arial" w:hAnsi="Arial" w:cs="Arial"/>
-          <w:color w:val="A6A6A6"/>
-          <w:sz w:val="10"/>
-        </w:rPr>
-        <w:t>.................................................................................................................................................................................................................................................................................................................................................................................................</w:t>
+          <w:b/>
+          <w:bCs/>
+          <w:sz w:val="28"/>
+          <w:szCs w:val="28"/>
+          <w:rtl/>
+        </w:rPr>
+        <w:t xml:space="preserve">سجل تجاري رقم:  </w:t>
       </w:r>
     </w:p>
     <w:p>
@@ -481,6 +490,29 @@
         <w:spacing w:after="0"/>
         <w:ind w:right="77"/>
       </w:pPr>
+      <w:proofErr w:type="spellStart"/>
+      <w:r>
+        <w:rPr>
+          <w:rFonts w:ascii="Arial" w:eastAsia="Arial" w:hAnsi="Arial" w:cs="Arial"/>
+          <w:sz w:val="28"/>
+        </w:rPr>
+        <w:t>cr_number</w:t>
+      </w:r>
+      <w:proofErr w:type="spellEnd"/>
+      <w:r>
+        <w:rPr>
+          <w:rFonts w:ascii="Arial" w:eastAsia="Arial" w:hAnsi="Arial" w:cs="Arial"/>
+          <w:sz w:val="28"/>
+        </w:rPr>
+        <w:t xml:space="preserve"> </w:t>
+      </w:r>
+    </w:p>
+    <w:p>
+      <w:pPr>
+        <w:bidi w:val="0"/>
+        <w:spacing w:after="0"/>
+        <w:ind w:right="77"/>
+      </w:pPr>
       <w:r>
         <w:rPr>
           <w:rFonts w:ascii="Arial" w:eastAsia="Arial" w:hAnsi="Arial" w:cs="Arial"/>
@@ -504,7 +536,7 @@
           <w:szCs w:val="28"/>
           <w:rtl/>
         </w:rPr>
-        <w:t xml:space="preserve">سجل تجاري رقم:  </w:t>
+        <w:t xml:space="preserve">اسم مقدم الطلب:  </w:t>
       </w:r>
     </w:p>
     <w:p>
@@ -519,7 +551,7 @@
           <w:rFonts w:ascii="Arial" w:eastAsia="Arial" w:hAnsi="Arial" w:cs="Arial"/>
           <w:sz w:val="28"/>
         </w:rPr>
-        <w:t>cr_number</w:t>
+        <w:t>full_name</w:t>
       </w:r>
       <w:proofErr w:type="spellEnd"/>
       <w:r>
@@ -533,37 +565,15 @@
     <w:p>
       <w:pPr>
         <w:bidi w:val="0"/>
-        <w:spacing w:after="0"/>
-        <w:ind w:right="6"/>
-      </w:pPr>
-      <w:r>
-        <w:rPr>
-          <w:rFonts w:ascii="Arial" w:eastAsia="Arial" w:hAnsi="Arial" w:cs="Arial"/>
-          <w:sz w:val="28"/>
-        </w:rPr>
-        <w:t xml:space="preserve"> </w:t>
-      </w:r>
-      <w:r>
-        <w:rPr>
-          <w:rFonts w:ascii="Arial" w:eastAsia="Arial" w:hAnsi="Arial" w:cs="Arial"/>
-          <w:color w:val="A6A6A6"/>
-          <w:sz w:val="10"/>
-        </w:rPr>
-        <w:t>.......................................................................................................................................................................................................................</w:t>
-      </w:r>
-    </w:p>
-    <w:p>
-      <w:pPr>
-        <w:bidi w:val="0"/>
-        <w:spacing w:after="0"/>
-        <w:ind w:right="77"/>
-      </w:pPr>
-      <w:r>
-        <w:rPr>
-          <w:rFonts w:ascii="Arial" w:eastAsia="Arial" w:hAnsi="Arial" w:cs="Arial"/>
-          <w:sz w:val="28"/>
-        </w:rPr>
-        <w:t xml:space="preserve"> </w:t>
+        <w:spacing w:after="25"/>
+        <w:ind w:right="646"/>
+      </w:pPr>
+      <w:r>
+        <w:rPr>
+          <w:rFonts w:ascii="Arial" w:eastAsia="Arial" w:hAnsi="Arial" w:cs="Arial"/>
+          <w:sz w:val="28"/>
+        </w:rPr>
+        <w:t xml:space="preserve">  </w:t>
       </w:r>
     </w:p>
     <w:p>
@@ -581,85 +591,6 @@
           <w:szCs w:val="28"/>
           <w:rtl/>
         </w:rPr>
-        <w:t xml:space="preserve">اسم مقدم الطلب:  </w:t>
-      </w:r>
-    </w:p>
-    <w:p>
-      <w:pPr>
-        <w:bidi w:val="0"/>
-        <w:spacing w:after="0"/>
-        <w:ind w:right="77"/>
-      </w:pPr>
-      <w:proofErr w:type="spellStart"/>
-      <w:r>
-        <w:rPr>
-          <w:rFonts w:ascii="Arial" w:eastAsia="Arial" w:hAnsi="Arial" w:cs="Arial"/>
-          <w:sz w:val="28"/>
-        </w:rPr>
-        <w:t>full_name</w:t>
-      </w:r>
-      <w:proofErr w:type="spellEnd"/>
-      <w:r>
-        <w:rPr>
-          <w:rFonts w:ascii="Arial" w:eastAsia="Arial" w:hAnsi="Arial" w:cs="Arial"/>
-          <w:sz w:val="28"/>
-        </w:rPr>
-        <w:t xml:space="preserve"> </w:t>
-      </w:r>
-    </w:p>
-    <w:p>
-      <w:pPr>
-        <w:bidi w:val="0"/>
-        <w:spacing w:after="0"/>
-        <w:ind w:right="6"/>
-      </w:pPr>
-      <w:r>
-        <w:rPr>
-          <w:rFonts w:ascii="Arial" w:eastAsia="Arial" w:hAnsi="Arial" w:cs="Arial"/>
-          <w:b/>
-          <w:sz w:val="28"/>
-        </w:rPr>
-        <w:t xml:space="preserve"> </w:t>
-      </w:r>
-      <w:r>
-        <w:rPr>
-          <w:rFonts w:ascii="Arial" w:eastAsia="Arial" w:hAnsi="Arial" w:cs="Arial"/>
-          <w:b/>
-          <w:color w:val="A6A6A6"/>
-          <w:sz w:val="10"/>
-        </w:rPr>
-        <w:t>.......................................................................................................................................................................................................................</w:t>
-      </w:r>
-    </w:p>
-    <w:p>
-      <w:pPr>
-        <w:bidi w:val="0"/>
-        <w:spacing w:after="25"/>
-        <w:ind w:right="646"/>
-      </w:pPr>
-      <w:r>
-        <w:rPr>
-          <w:rFonts w:ascii="Arial" w:eastAsia="Arial" w:hAnsi="Arial" w:cs="Arial"/>
-          <w:sz w:val="28"/>
-        </w:rPr>
-        <w:t xml:space="preserve">  </w:t>
-      </w:r>
-    </w:p>
-    <w:p>
-      <w:pPr>
-        <w:spacing w:after="0"/>
-        <w:ind w:left="-3" w:hanging="10"/>
-        <w:jc w:val="left"/>
-      </w:pPr>
-      <w:r>
-        <w:rPr>
-          <w:rFonts w:ascii="Arial" w:eastAsia="Arial" w:hAnsi="Arial" w:cs="Arial"/>
-          <w:b/>
-          <w:bCs/>
-          <w:sz w:val="28"/>
-          <w:szCs w:val="28"/>
-          <w:rtl/>
-        </w:rPr>
         <w:t>ويشُار إليها ل</w:t>
       </w:r>
       <w:r>
@@ -1021,7 +952,6 @@
         <w:rPr>
           <w:sz w:val="28"/>
         </w:rPr>
-        <w:lastRenderedPageBreak/>
         <w:t xml:space="preserve"> </w:t>
       </w:r>
     </w:p>
@@ -1040,6 +970,7 @@
           <w:szCs w:val="28"/>
           <w:rtl/>
         </w:rPr>
+        <w:lastRenderedPageBreak/>
         <w:t>المادة</w:t>
       </w:r>
       <w:r>
@@ -1959,7 +1890,6 @@
         <w:rPr>
           <w:sz w:val="28"/>
         </w:rPr>
-        <w:lastRenderedPageBreak/>
         <w:t xml:space="preserve"> </w:t>
       </w:r>
     </w:p>
@@ -1978,6 +1908,7 @@
           <w:szCs w:val="28"/>
           <w:rtl/>
         </w:rPr>
+        <w:lastRenderedPageBreak/>
         <w:t>المادة</w:t>
       </w:r>
       <w:r>
@@ -2855,7 +2786,6 @@
           <w:szCs w:val="28"/>
           <w:rtl/>
         </w:rPr>
-        <w:lastRenderedPageBreak/>
         <w:t>المادة</w:t>
       </w:r>
       <w:r>
@@ -2947,6 +2877,7 @@
           <w:szCs w:val="28"/>
           <w:rtl/>
         </w:rPr>
+        <w:lastRenderedPageBreak/>
         <w:t xml:space="preserve">تعود ملكية جميع الصور والفيديوهات والمحتوى الإعلامي المصوّر داخل المعرض إلى </w:t>
       </w:r>
       <w:r>

</xml_diff>

<commit_message>
working but need line breaks fixes
</commit_message>
<xml_diff>
--- a/public/contract.docx
+++ b/public/contract.docx
@@ -85,33 +85,22 @@
           <w:szCs w:val="28"/>
           <w:rtl/>
         </w:rPr>
-        <w:t xml:space="preserve">: </w:t>
-      </w:r>
-    </w:p>
-    <w:p>
-      <w:pPr>
-        <w:spacing w:after="0" w:line="365" w:lineRule="auto"/>
-        <w:ind w:left="1" w:right="9379" w:hanging="1"/>
-        <w:rPr>
-          <w:rFonts w:ascii="Arial" w:eastAsia="Arial" w:hAnsi="Arial" w:cs="Arial"/>
-          <w:b/>
-          <w:bCs/>
-          <w:sz w:val="28"/>
-          <w:szCs w:val="28"/>
-          <w:rtl/>
-        </w:rPr>
-      </w:pPr>
-      <w:r>
-        <w:rPr>
-          <w:rFonts w:ascii="Arial" w:eastAsia="Arial" w:hAnsi="Arial" w:cs="Arial"/>
-          <w:b/>
-          <w:bCs/>
-          <w:sz w:val="28"/>
-          <w:szCs w:val="28"/>
-          <w:rtl/>
-        </w:rPr>
-        <w:t>أو</w:t>
-      </w:r>
+        <w:t>:</w:t>
+      </w:r>
+    </w:p>
+    <w:p>
+      <w:pPr>
+        <w:spacing w:after="208"/>
+        <w:ind w:left="4" w:hanging="10"/>
+        <w:jc w:val="left"/>
+        <w:rPr>
+          <w:rFonts w:ascii="Arial" w:eastAsia="Arial" w:hAnsi="Arial" w:cs="Arial"/>
+          <w:b/>
+          <w:bCs/>
+          <w:sz w:val="28"/>
+          <w:szCs w:val="28"/>
+        </w:rPr>
+      </w:pPr>
       <w:r>
         <w:rPr>
           <w:rFonts w:ascii="Arial" w:eastAsia="Arial" w:hAnsi="Arial" w:cs="Arial" w:hint="cs"/>
@@ -121,11 +110,82 @@
           <w:szCs w:val="28"/>
           <w:rtl/>
         </w:rPr>
-        <w:t>لا</w:t>
-      </w:r>
-      <w:r>
-        <w:rPr>
-          <w:rFonts w:ascii="Arial" w:eastAsia="Arial" w:hAnsi="Arial" w:cs="Arial"/>
+        <w:t>أولا: أطرا</w:t>
+      </w:r>
+      <w:r>
+        <w:rPr>
+          <w:rFonts w:ascii="Arial" w:eastAsia="Arial" w:hAnsi="Arial" w:cs="Arial" w:hint="eastAsia"/>
+          <w:b/>
+          <w:bCs/>
+          <w:sz w:val="28"/>
+          <w:szCs w:val="28"/>
+          <w:rtl/>
+        </w:rPr>
+        <w:t>ف</w:t>
+      </w:r>
+      <w:r>
+        <w:rPr>
+          <w:rFonts w:ascii="Arial" w:eastAsia="Arial" w:hAnsi="Arial" w:cs="Arial"/>
+          <w:b/>
+          <w:bCs/>
+          <w:sz w:val="28"/>
+          <w:szCs w:val="28"/>
+        </w:rPr>
+        <w:t xml:space="preserve"> </w:t>
+      </w:r>
+      <w:r>
+        <w:rPr>
+          <w:rFonts w:ascii="Arial" w:eastAsia="Arial" w:hAnsi="Arial" w:cs="Arial" w:hint="cs"/>
+          <w:b/>
+          <w:bCs/>
+          <w:sz w:val="28"/>
+          <w:szCs w:val="28"/>
+          <w:rtl/>
+        </w:rPr>
+        <w:t>العقد</w:t>
+      </w:r>
+    </w:p>
+    <w:p>
+      <w:pPr>
+        <w:spacing w:after="208"/>
+        <w:ind w:left="4" w:hanging="10"/>
+        <w:jc w:val="left"/>
+      </w:pPr>
+      <w:r>
+        <w:rPr>
+          <w:rFonts w:ascii="Arial" w:eastAsia="Arial" w:hAnsi="Arial" w:cs="Arial" w:hint="cs"/>
+          <w:b/>
+          <w:bCs/>
+          <w:sz w:val="28"/>
+          <w:szCs w:val="28"/>
+          <w:rtl/>
+        </w:rPr>
+        <w:t>الطر</w:t>
+      </w:r>
+      <w:r>
+        <w:rPr>
+          <w:rFonts w:ascii="Arial" w:eastAsia="Arial" w:hAnsi="Arial" w:cs="Arial" w:hint="eastAsia"/>
+          <w:b/>
+          <w:bCs/>
+          <w:sz w:val="28"/>
+          <w:szCs w:val="28"/>
+          <w:rtl/>
+        </w:rPr>
+        <w:t>ف</w:t>
+      </w:r>
+      <w:r>
+        <w:rPr>
+          <w:rFonts w:ascii="Arial" w:eastAsia="Arial" w:hAnsi="Arial" w:cs="Arial"/>
+          <w:b/>
+          <w:bCs/>
+          <w:sz w:val="28"/>
+          <w:szCs w:val="28"/>
+          <w:rtl/>
+        </w:rPr>
+        <w:t xml:space="preserve"> الأول</w:t>
+      </w:r>
+      <w:r>
+        <w:rPr>
           <w:b/>
           <w:bCs/>
           <w:sz w:val="28"/>
@@ -134,100 +194,10 @@
         </w:rPr>
         <w:t>:</w:t>
       </w:r>
-      <w:r>
-        <w:rPr>
-          <w:rFonts w:ascii="Arial" w:eastAsia="Arial" w:hAnsi="Arial" w:cs="Arial" w:hint="cs"/>
-          <w:b/>
-          <w:bCs/>
-          <w:sz w:val="28"/>
-          <w:szCs w:val="28"/>
-          <w:rtl/>
-        </w:rPr>
-        <w:t xml:space="preserve"> </w:t>
-      </w:r>
-      <w:r>
-        <w:rPr>
-          <w:rFonts w:ascii="Arial" w:eastAsia="Arial" w:hAnsi="Arial" w:cs="Arial"/>
-          <w:b/>
-          <w:bCs/>
-          <w:sz w:val="28"/>
-          <w:szCs w:val="28"/>
-          <w:rtl/>
-        </w:rPr>
-        <w:t>أطراف</w:t>
-      </w:r>
-      <w:r>
-        <w:rPr>
-          <w:rFonts w:ascii="Arial" w:eastAsia="Arial" w:hAnsi="Arial" w:cs="Arial" w:hint="cs"/>
-          <w:b/>
-          <w:bCs/>
-          <w:sz w:val="28"/>
-          <w:szCs w:val="28"/>
-          <w:rtl/>
-        </w:rPr>
-        <w:t xml:space="preserve"> </w:t>
-      </w:r>
-      <w:r>
-        <w:rPr>
-          <w:rFonts w:ascii="Arial" w:eastAsia="Arial" w:hAnsi="Arial" w:cs="Arial"/>
-          <w:b/>
-          <w:bCs/>
-          <w:sz w:val="28"/>
-          <w:szCs w:val="28"/>
-          <w:rtl/>
-        </w:rPr>
-        <w:t>العق</w:t>
-      </w:r>
-      <w:r>
-        <w:rPr>
-          <w:rFonts w:ascii="Arial" w:eastAsia="Arial" w:hAnsi="Arial" w:cs="Arial" w:hint="cs"/>
-          <w:b/>
-          <w:bCs/>
-          <w:sz w:val="28"/>
-          <w:szCs w:val="28"/>
-          <w:rtl/>
-        </w:rPr>
-        <w:t>د</w:t>
-      </w:r>
-    </w:p>
-    <w:p>
-      <w:pPr>
-        <w:spacing w:after="0" w:line="365" w:lineRule="auto"/>
-        <w:ind w:left="1" w:right="9379" w:hanging="1"/>
-      </w:pPr>
-      <w:r>
-        <w:rPr>
-          <w:rFonts w:ascii="Arial" w:eastAsia="Arial" w:hAnsi="Arial" w:cs="Arial"/>
-          <w:b/>
-          <w:bCs/>
-          <w:sz w:val="28"/>
-          <w:szCs w:val="28"/>
-          <w:rtl/>
-        </w:rPr>
-        <w:t>الطرف الأول</w:t>
-      </w:r>
-      <w:r>
-        <w:rPr>
-          <w:b/>
-          <w:bCs/>
-          <w:sz w:val="28"/>
-          <w:szCs w:val="28"/>
-          <w:rtl/>
-        </w:rPr>
-        <w:t>:</w:t>
-      </w:r>
-      <w:r>
-        <w:rPr>
-          <w:sz w:val="28"/>
-          <w:szCs w:val="28"/>
-          <w:rtl/>
-        </w:rPr>
-        <w:t xml:space="preserve"> </w:t>
-      </w:r>
-    </w:p>
-    <w:p>
-      <w:pPr>
-        <w:spacing w:after="6"/>
+    </w:p>
+    <w:p>
+      <w:pPr>
+        <w:spacing w:after="208"/>
         <w:ind w:left="4" w:hanging="10"/>
         <w:jc w:val="left"/>
       </w:pPr>
@@ -239,21 +209,13 @@
           <w:rtl/>
         </w:rPr>
         <w:t>شركة مظلة الأعمال لتنظيم المعارض والمؤتمرات، شركة ذات مسؤولية محدودة،</w:t>
-      </w:r>
-      <w:r>
-        <w:rPr>
-          <w:sz w:val="28"/>
-          <w:szCs w:val="28"/>
-          <w:rtl/>
-        </w:rPr>
-        <w:t xml:space="preserve"> </w:t>
       </w:r>
     </w:p>
     <w:p>
       <w:pPr>
         <w:spacing w:after="0" w:line="321" w:lineRule="auto"/>
         <w:ind w:left="4" w:right="571" w:hanging="4"/>
-        <w:jc w:val="both"/>
+        <w:jc w:val="left"/>
         <w:rPr>
           <w:rFonts w:ascii="Arial" w:eastAsia="Arial" w:hAnsi="Arial" w:cs="Arial"/>
           <w:sz w:val="28"/>
@@ -341,7 +303,7 @@
       <w:pPr>
         <w:spacing w:after="0" w:line="321" w:lineRule="auto"/>
         <w:ind w:left="4" w:right="571" w:hanging="4"/>
-        <w:jc w:val="both"/>
+        <w:jc w:val="left"/>
         <w:rPr>
           <w:rFonts w:ascii="Arial" w:eastAsia="Arial" w:hAnsi="Arial" w:cs="Arial"/>
           <w:sz w:val="28"/>
@@ -381,7 +343,7 @@
       <w:pPr>
         <w:spacing w:after="0" w:line="321" w:lineRule="auto"/>
         <w:ind w:left="4" w:right="571" w:hanging="4"/>
-        <w:jc w:val="both"/>
+        <w:jc w:val="left"/>
       </w:pPr>
       <w:r>
         <w:rPr>
@@ -403,14 +365,6 @@
           <w:rtl/>
         </w:rPr>
         <w:t>:</w:t>
-      </w:r>
-      <w:r>
-        <w:rPr>
-          <w:sz w:val="28"/>
-          <w:szCs w:val="28"/>
-          <w:rtl/>
-        </w:rPr>
-        <w:t xml:space="preserve"> </w:t>
       </w:r>
     </w:p>
     <w:p>
@@ -428,7 +382,7 @@
           <w:szCs w:val="28"/>
           <w:rtl/>
         </w:rPr>
-        <w:t xml:space="preserve">اسم الجهة/ الشركة المتقدمة بطلب المشاركة في المعرض عبر الموقع الإلكتروني: </w:t>
+        <w:t>اسم الجهة/ الشركة المتقدمة بطلب المشاركة في المعرض عبر الموقع الإلكتروني:</w:t>
       </w:r>
     </w:p>
     <w:p>
@@ -436,6 +390,7 @@
         <w:bidi w:val="0"/>
         <w:spacing w:after="0"/>
         <w:ind w:right="77"/>
+        <w:jc w:val="left"/>
       </w:pPr>
       <w:r>
         <w:rPr>
@@ -444,12 +399,23 @@
         </w:rPr>
         <w:t>organization</w:t>
       </w:r>
-      <w:r>
-        <w:rPr>
-          <w:rFonts w:ascii="Arial" w:eastAsia="Arial" w:hAnsi="Arial" w:cs="Arial"/>
-          <w:sz w:val="28"/>
-        </w:rPr>
-        <w:t xml:space="preserve"> </w:t>
+    </w:p>
+    <w:p>
+      <w:pPr>
+        <w:spacing w:after="0"/>
+        <w:ind w:left="-3" w:hanging="10"/>
+        <w:jc w:val="left"/>
+      </w:pPr>
+      <w:r>
+        <w:rPr>
+          <w:rFonts w:ascii="Arial" w:eastAsia="Arial" w:hAnsi="Arial" w:cs="Arial"/>
+          <w:b/>
+          <w:bCs/>
+          <w:sz w:val="28"/>
+          <w:szCs w:val="28"/>
+          <w:rtl/>
+        </w:rPr>
+        <w:t>سجل تجاري رقم:</w:t>
       </w:r>
     </w:p>
     <w:p>
@@ -457,14 +423,17 @@
         <w:bidi w:val="0"/>
         <w:spacing w:after="0"/>
         <w:ind w:right="77"/>
-      </w:pPr>
-      <w:r>
-        <w:rPr>
-          <w:rFonts w:ascii="Arial" w:eastAsia="Arial" w:hAnsi="Arial" w:cs="Arial"/>
-          <w:sz w:val="28"/>
-        </w:rPr>
-        <w:t xml:space="preserve"> </w:t>
-      </w:r>
+        <w:jc w:val="left"/>
+      </w:pPr>
+      <w:proofErr w:type="spellStart"/>
+      <w:r>
+        <w:rPr>
+          <w:rFonts w:ascii="Arial" w:eastAsia="Arial" w:hAnsi="Arial" w:cs="Arial"/>
+          <w:sz w:val="28"/>
+        </w:rPr>
+        <w:t>cr_number</w:t>
+      </w:r>
+      <w:proofErr w:type="spellEnd"/>
     </w:p>
     <w:p>
       <w:pPr>
@@ -481,7 +450,7 @@
           <w:szCs w:val="28"/>
           <w:rtl/>
         </w:rPr>
-        <w:t xml:space="preserve">سجل تجاري رقم:  </w:t>
+        <w:t>اسم مقدم الطلب:</w:t>
       </w:r>
     </w:p>
     <w:p>
@@ -489,6 +458,7 @@
         <w:bidi w:val="0"/>
         <w:spacing w:after="0"/>
         <w:ind w:right="77"/>
+        <w:jc w:val="left"/>
       </w:pPr>
       <w:proofErr w:type="spellStart"/>
       <w:r>
@@ -496,30 +466,9 @@
           <w:rFonts w:ascii="Arial" w:eastAsia="Arial" w:hAnsi="Arial" w:cs="Arial"/>
           <w:sz w:val="28"/>
         </w:rPr>
-        <w:t>cr_number</w:t>
+        <w:t>full_name</w:t>
       </w:r>
       <w:proofErr w:type="spellEnd"/>
-      <w:r>
-        <w:rPr>
-          <w:rFonts w:ascii="Arial" w:eastAsia="Arial" w:hAnsi="Arial" w:cs="Arial"/>
-          <w:sz w:val="28"/>
-        </w:rPr>
-        <w:t xml:space="preserve"> </w:t>
-      </w:r>
-    </w:p>
-    <w:p>
-      <w:pPr>
-        <w:bidi w:val="0"/>
-        <w:spacing w:after="0"/>
-        <w:ind w:right="77"/>
-      </w:pPr>
-      <w:r>
-        <w:rPr>
-          <w:rFonts w:ascii="Arial" w:eastAsia="Arial" w:hAnsi="Arial" w:cs="Arial"/>
-          <w:sz w:val="28"/>
-        </w:rPr>
-        <w:t xml:space="preserve"> </w:t>
-      </w:r>
     </w:p>
     <w:p>
       <w:pPr>
@@ -536,61 +485,6 @@
           <w:szCs w:val="28"/>
           <w:rtl/>
         </w:rPr>
-        <w:t xml:space="preserve">اسم مقدم الطلب:  </w:t>
-      </w:r>
-    </w:p>
-    <w:p>
-      <w:pPr>
-        <w:bidi w:val="0"/>
-        <w:spacing w:after="0"/>
-        <w:ind w:right="77"/>
-      </w:pPr>
-      <w:proofErr w:type="spellStart"/>
-      <w:r>
-        <w:rPr>
-          <w:rFonts w:ascii="Arial" w:eastAsia="Arial" w:hAnsi="Arial" w:cs="Arial"/>
-          <w:sz w:val="28"/>
-        </w:rPr>
-        <w:t>full_name</w:t>
-      </w:r>
-      <w:proofErr w:type="spellEnd"/>
-      <w:r>
-        <w:rPr>
-          <w:rFonts w:ascii="Arial" w:eastAsia="Arial" w:hAnsi="Arial" w:cs="Arial"/>
-          <w:sz w:val="28"/>
-        </w:rPr>
-        <w:t xml:space="preserve"> </w:t>
-      </w:r>
-    </w:p>
-    <w:p>
-      <w:pPr>
-        <w:bidi w:val="0"/>
-        <w:spacing w:after="25"/>
-        <w:ind w:right="646"/>
-      </w:pPr>
-      <w:r>
-        <w:rPr>
-          <w:rFonts w:ascii="Arial" w:eastAsia="Arial" w:hAnsi="Arial" w:cs="Arial"/>
-          <w:sz w:val="28"/>
-        </w:rPr>
-        <w:t xml:space="preserve">  </w:t>
-      </w:r>
-    </w:p>
-    <w:p>
-      <w:pPr>
-        <w:spacing w:after="0"/>
-        <w:ind w:left="-3" w:hanging="10"/>
-        <w:jc w:val="left"/>
-      </w:pPr>
-      <w:r>
-        <w:rPr>
-          <w:rFonts w:ascii="Arial" w:eastAsia="Arial" w:hAnsi="Arial" w:cs="Arial"/>
-          <w:b/>
-          <w:bCs/>
-          <w:sz w:val="28"/>
-          <w:szCs w:val="28"/>
-          <w:rtl/>
-        </w:rPr>
         <w:t>ويشُار إليها ل</w:t>
       </w:r>
       <w:r>
@@ -647,20 +541,6 @@
           <w:rtl/>
         </w:rPr>
         <w:t>ي)</w:t>
-      </w:r>
-    </w:p>
-    <w:p>
-      <w:pPr>
-        <w:bidi w:val="0"/>
-        <w:spacing w:after="169"/>
-        <w:ind w:right="77"/>
-      </w:pPr>
-      <w:r>
-        <w:rPr>
-          <w:rFonts w:ascii="Arial" w:eastAsia="Arial" w:hAnsi="Arial" w:cs="Arial"/>
-          <w:sz w:val="28"/>
-        </w:rPr>
-        <w:t xml:space="preserve"> </w:t>
       </w:r>
     </w:p>
     <w:p>
@@ -676,21 +556,15 @@
           <w:szCs w:val="28"/>
           <w:rtl/>
         </w:rPr>
-        <w:t xml:space="preserve"> وقد اتفق الطرفان وهما بكامل أهليتهما الشرعية والنظامية على ما يلي</w:t>
-      </w:r>
-      <w:r>
-        <w:rPr>
-          <w:sz w:val="28"/>
-          <w:szCs w:val="28"/>
-          <w:rtl/>
-        </w:rPr>
-        <w:t xml:space="preserve">: </w:t>
-      </w:r>
-      <w:r>
-        <w:rPr>
-          <w:sz w:val="28"/>
-        </w:rPr>
-        <w:t xml:space="preserve"> </w:t>
+        <w:t>وقد اتفق الطرفان وهما بكامل أهليتهما الشرعية والنظامية على ما يلي</w:t>
+      </w:r>
+      <w:r>
+        <w:rPr>
+          <w:sz w:val="28"/>
+          <w:szCs w:val="28"/>
+          <w:rtl/>
+        </w:rPr>
+        <w:t>:</w:t>
       </w:r>
     </w:p>
     <w:p>
@@ -701,17 +575,6 @@
       </w:pPr>
       <w:r>
         <w:rPr>
-          <w:rFonts w:ascii="Arial" w:eastAsia="Arial" w:hAnsi="Arial" w:cs="Arial"/>
-          <w:b/>
-          <w:bCs/>
-          <w:sz w:val="28"/>
-          <w:szCs w:val="28"/>
-          <w:rtl/>
-        </w:rPr>
-        <w:t>المادة</w:t>
-      </w:r>
-      <w:r>
-        <w:rPr>
           <w:rFonts w:ascii="Arial" w:eastAsia="Arial" w:hAnsi="Arial" w:cs="Arial" w:hint="cs"/>
           <w:b/>
           <w:bCs/>
@@ -719,25 +582,27 @@
           <w:szCs w:val="28"/>
           <w:rtl/>
         </w:rPr>
+        <w:t xml:space="preserve">المادة </w:t>
+      </w:r>
+      <w:r>
+        <w:rPr>
+          <w:rFonts w:ascii="Arial" w:eastAsia="Arial" w:hAnsi="Arial" w:cs="Arial"/>
+          <w:b/>
+          <w:bCs/>
+          <w:sz w:val="28"/>
+          <w:szCs w:val="28"/>
+          <w:rtl/>
+        </w:rPr>
         <w:t>(</w:t>
       </w:r>
       <w:r>
         <w:rPr>
-          <w:rFonts w:ascii="Arial" w:eastAsia="Arial" w:hAnsi="Arial" w:cs="Arial"/>
-          <w:b/>
-          <w:bCs/>
-          <w:sz w:val="28"/>
-          <w:szCs w:val="28"/>
-          <w:rtl/>
-        </w:rPr>
-        <w:t xml:space="preserve"> </w:t>
-      </w:r>
-      <w:r>
-        <w:rPr>
-          <w:b/>
-          <w:bCs/>
-          <w:sz w:val="28"/>
-          <w:szCs w:val="28"/>
+          <w:rFonts w:ascii="Arial" w:eastAsia="Arial" w:hAnsi="Arial" w:cs="Arial" w:hint="cs"/>
+          <w:b/>
+          <w:bCs/>
+          <w:sz w:val="28"/>
+          <w:szCs w:val="28"/>
+          <w:rtl/>
         </w:rPr>
         <w:t>1</w:t>
       </w:r>
@@ -762,16 +627,6 @@
           <w:rtl/>
         </w:rPr>
         <w:t>: موضوع العقد</w:t>
-      </w:r>
-      <w:r>
-        <w:rPr>
-          <w:b/>
-          <w:bCs/>
-          <w:sz w:val="28"/>
-          <w:szCs w:val="28"/>
-          <w:rtl/>
-        </w:rPr>
-        <w:t xml:space="preserve"> </w:t>
       </w:r>
     </w:p>
     <w:p>
@@ -839,21 +694,12 @@
         </w:rPr>
         <w:t>.......................................................</w:t>
       </w:r>
-      <w:r>
-        <w:rPr>
-          <w:rFonts w:ascii="Arial" w:eastAsia="Arial" w:hAnsi="Arial" w:cs="Arial"/>
-          <w:sz w:val="28"/>
-          <w:szCs w:val="28"/>
-          <w:rtl/>
-        </w:rPr>
-        <w:t xml:space="preserve"> </w:t>
-      </w:r>
     </w:p>
     <w:p>
       <w:pPr>
         <w:spacing w:after="174" w:line="260" w:lineRule="auto"/>
         <w:ind w:left="4" w:right="237" w:hanging="4"/>
-        <w:jc w:val="both"/>
+        <w:jc w:val="left"/>
       </w:pPr>
       <w:r>
         <w:rPr>
@@ -939,20 +785,7 @@
           <w:szCs w:val="28"/>
           <w:rtl/>
         </w:rPr>
-        <w:t xml:space="preserve">. </w:t>
-      </w:r>
-    </w:p>
-    <w:p>
-      <w:pPr>
-        <w:bidi w:val="0"/>
-        <w:spacing w:after="163"/>
-        <w:ind w:right="103"/>
-      </w:pPr>
-      <w:r>
-        <w:rPr>
-          <w:sz w:val="28"/>
-        </w:rPr>
-        <w:t xml:space="preserve"> </w:t>
+        <w:t>.</w:t>
       </w:r>
     </w:p>
     <w:p>
@@ -970,7 +803,6 @@
           <w:szCs w:val="28"/>
           <w:rtl/>
         </w:rPr>
-        <w:lastRenderedPageBreak/>
         <w:t>المادة</w:t>
       </w:r>
       <w:r>
@@ -982,27 +814,18 @@
           <w:szCs w:val="28"/>
           <w:rtl/>
         </w:rPr>
-        <w:t xml:space="preserve"> (</w:t>
-      </w:r>
-      <w:r>
-        <w:rPr>
-          <w:rFonts w:ascii="Arial" w:eastAsia="Arial" w:hAnsi="Arial" w:cs="Arial"/>
-          <w:b/>
-          <w:bCs/>
-          <w:sz w:val="28"/>
-          <w:szCs w:val="28"/>
-          <w:rtl/>
-        </w:rPr>
         <w:t xml:space="preserve"> </w:t>
       </w:r>
       <w:r>
         <w:rPr>
-          <w:b/>
-          <w:bCs/>
-          <w:sz w:val="28"/>
-          <w:szCs w:val="28"/>
-        </w:rPr>
-        <w:t>2</w:t>
+          <w:rFonts w:ascii="Arial" w:eastAsia="Arial" w:hAnsi="Arial" w:cs="Arial" w:hint="cs"/>
+          <w:b/>
+          <w:bCs/>
+          <w:sz w:val="28"/>
+          <w:szCs w:val="28"/>
+          <w:rtl/>
+        </w:rPr>
+        <w:t>(2</w:t>
       </w:r>
       <w:r>
         <w:rPr>
@@ -1025,23 +848,13 @@
           <w:rtl/>
         </w:rPr>
         <w:t>: مدة العقد</w:t>
-      </w:r>
-      <w:r>
-        <w:rPr>
-          <w:b/>
-          <w:bCs/>
-          <w:sz w:val="28"/>
-          <w:szCs w:val="28"/>
-          <w:rtl/>
-        </w:rPr>
-        <w:t xml:space="preserve"> </w:t>
       </w:r>
     </w:p>
     <w:p>
       <w:pPr>
         <w:spacing w:after="174" w:line="260" w:lineRule="auto"/>
         <w:ind w:left="4" w:right="400" w:hanging="4"/>
-        <w:jc w:val="both"/>
+        <w:jc w:val="left"/>
       </w:pPr>
       <w:r>
         <w:rPr>
@@ -1218,7 +1031,7 @@
           <w:szCs w:val="28"/>
           <w:rtl/>
         </w:rPr>
-        <w:t xml:space="preserve">. </w:t>
+        <w:t>.</w:t>
       </w:r>
     </w:p>
     <w:p>
@@ -1226,13 +1039,8 @@
         <w:bidi w:val="0"/>
         <w:spacing w:after="166"/>
         <w:ind w:right="103"/>
-      </w:pPr>
-      <w:r>
-        <w:rPr>
-          <w:sz w:val="28"/>
-        </w:rPr>
-        <w:t xml:space="preserve"> </w:t>
-      </w:r>
+        <w:jc w:val="left"/>
+      </w:pPr>
     </w:p>
     <w:p>
       <w:pPr>
@@ -1283,16 +1091,6 @@
           <w:rtl/>
         </w:rPr>
         <w:t>: قيمة العقد وشروط الدفع</w:t>
-      </w:r>
-      <w:r>
-        <w:rPr>
-          <w:b/>
-          <w:bCs/>
-          <w:sz w:val="28"/>
-          <w:szCs w:val="28"/>
-          <w:rtl/>
-        </w:rPr>
-        <w:t xml:space="preserve"> </w:t>
       </w:r>
     </w:p>
     <w:p>
@@ -1376,7 +1174,7 @@
           <w:szCs w:val="28"/>
           <w:rtl/>
         </w:rPr>
-        <w:t xml:space="preserve">. </w:t>
+        <w:t>.</w:t>
       </w:r>
     </w:p>
     <w:p>
@@ -1396,15 +1194,7 @@
           <w:szCs w:val="28"/>
           <w:rtl/>
         </w:rPr>
-        <w:t xml:space="preserve">يجب تحويل المدفوعات صافية من أي رسوم بنكية او ضرائب. </w:t>
-      </w:r>
-      <w:r>
-        <w:rPr>
-          <w:sz w:val="28"/>
-          <w:szCs w:val="28"/>
-          <w:rtl/>
-        </w:rPr>
-        <w:t xml:space="preserve"> </w:t>
+        <w:t>يجب تحويل المدفوعات صافية من أي رسوم بنكية او ضرائب.</w:t>
       </w:r>
     </w:p>
     <w:p>
@@ -1452,7 +1242,7 @@
           <w:szCs w:val="28"/>
           <w:rtl/>
         </w:rPr>
-        <w:t xml:space="preserve">. </w:t>
+        <w:t>.</w:t>
       </w:r>
     </w:p>
     <w:p>
@@ -1480,7 +1270,7 @@
           <w:szCs w:val="28"/>
           <w:rtl/>
         </w:rPr>
-        <w:t xml:space="preserve">. </w:t>
+        <w:t>.</w:t>
       </w:r>
     </w:p>
     <w:p>
@@ -1500,7 +1290,7 @@
           <w:szCs w:val="28"/>
           <w:rtl/>
         </w:rPr>
-        <w:t xml:space="preserve">يلتزم الطرف الثاني بتزويد الطرف الأول بصورة من الحوالة البنكية عبر البريد الإلكتروني </w:t>
+        <w:t>يلتزم الطرف الثاني بتزويد الطرف الأول بصورة من الحوالة البنكية عبر البريد الإلكتروني</w:t>
       </w:r>
     </w:p>
     <w:p>
@@ -1535,6 +1325,7 @@
         </w:rPr>
         <w:t xml:space="preserve">)، وإلا سيعتبر الحجز </w:t>
       </w:r>
+      <w:proofErr w:type="gramStart"/>
       <w:r>
         <w:rPr>
           <w:rFonts w:ascii="Arial" w:eastAsia="Arial" w:hAnsi="Arial" w:cs="Arial" w:hint="cs"/>
@@ -1563,27 +1354,7 @@
         </w:rPr>
         <w:t xml:space="preserve"> .</w:t>
       </w:r>
-      <w:r>
-        <w:rPr>
-          <w:sz w:val="28"/>
-          <w:szCs w:val="28"/>
-          <w:rtl/>
-        </w:rPr>
-        <w:t xml:space="preserve"> </w:t>
-      </w:r>
-    </w:p>
-    <w:p>
-      <w:pPr>
-        <w:bidi w:val="0"/>
-        <w:spacing w:after="166"/>
-        <w:ind w:right="103"/>
-      </w:pPr>
-      <w:r>
-        <w:rPr>
-          <w:sz w:val="28"/>
-        </w:rPr>
-        <w:t xml:space="preserve"> </w:t>
-      </w:r>
+      <w:proofErr w:type="gramEnd"/>
     </w:p>
     <w:p>
       <w:pPr>
@@ -1635,16 +1406,6 @@
         </w:rPr>
         <w:t>: التزامات الطرف الثاني</w:t>
       </w:r>
-      <w:r>
-        <w:rPr>
-          <w:b/>
-          <w:bCs/>
-          <w:sz w:val="28"/>
-          <w:szCs w:val="28"/>
-          <w:rtl/>
-        </w:rPr>
-        <w:t xml:space="preserve"> </w:t>
-      </w:r>
     </w:p>
     <w:p>
       <w:pPr>
@@ -1687,7 +1448,7 @@
           <w:szCs w:val="28"/>
           <w:rtl/>
         </w:rPr>
-        <w:t xml:space="preserve">: </w:t>
+        <w:t>:</w:t>
       </w:r>
     </w:p>
     <w:p>
@@ -1698,7 +1459,7 @@
         </w:numPr>
         <w:spacing w:after="167"/>
         <w:ind w:right="489" w:hanging="367"/>
-        <w:jc w:val="both"/>
+        <w:jc w:val="left"/>
       </w:pPr>
       <w:r>
         <w:rPr>
@@ -1715,7 +1476,7 @@
           <w:szCs w:val="28"/>
           <w:rtl/>
         </w:rPr>
-        <w:t xml:space="preserve">. </w:t>
+        <w:t>.</w:t>
       </w:r>
     </w:p>
     <w:p>
@@ -1726,7 +1487,7 @@
         </w:numPr>
         <w:spacing w:after="174" w:line="260" w:lineRule="auto"/>
         <w:ind w:right="489" w:hanging="367"/>
-        <w:jc w:val="both"/>
+        <w:jc w:val="left"/>
       </w:pPr>
       <w:r>
         <w:rPr>
@@ -1743,7 +1504,7 @@
           <w:szCs w:val="28"/>
           <w:rtl/>
         </w:rPr>
-        <w:t xml:space="preserve">. </w:t>
+        <w:t>.</w:t>
       </w:r>
     </w:p>
     <w:p>
@@ -1754,7 +1515,7 @@
         </w:numPr>
         <w:spacing w:after="174" w:line="260" w:lineRule="auto"/>
         <w:ind w:right="489" w:hanging="367"/>
-        <w:jc w:val="both"/>
+        <w:jc w:val="left"/>
       </w:pPr>
       <w:r>
         <w:rPr>
@@ -1782,7 +1543,7 @@
           <w:szCs w:val="28"/>
           <w:rtl/>
         </w:rPr>
-        <w:t xml:space="preserve">. </w:t>
+        <w:t>.</w:t>
       </w:r>
     </w:p>
     <w:p>
@@ -1793,7 +1554,7 @@
         </w:numPr>
         <w:spacing w:after="167"/>
         <w:ind w:right="489" w:hanging="367"/>
-        <w:jc w:val="both"/>
+        <w:jc w:val="left"/>
       </w:pPr>
       <w:r>
         <w:rPr>
@@ -1810,7 +1571,7 @@
           <w:szCs w:val="28"/>
           <w:rtl/>
         </w:rPr>
-        <w:t xml:space="preserve">. </w:t>
+        <w:t>.</w:t>
       </w:r>
     </w:p>
     <w:p>
@@ -1821,7 +1582,7 @@
         </w:numPr>
         <w:spacing w:after="174" w:line="260" w:lineRule="auto"/>
         <w:ind w:right="489" w:hanging="367"/>
-        <w:jc w:val="both"/>
+        <w:jc w:val="left"/>
       </w:pPr>
       <w:r>
         <w:rPr>
@@ -1849,7 +1610,7 @@
           <w:szCs w:val="28"/>
           <w:rtl/>
         </w:rPr>
-        <w:t xml:space="preserve">. </w:t>
+        <w:t>.</w:t>
       </w:r>
     </w:p>
     <w:p>
@@ -1860,37 +1621,16 @@
         </w:numPr>
         <w:spacing w:after="174" w:line="260" w:lineRule="auto"/>
         <w:ind w:right="489" w:hanging="367"/>
-        <w:jc w:val="both"/>
-      </w:pPr>
-      <w:r>
-        <w:rPr>
-          <w:rFonts w:ascii="Arial" w:eastAsia="Arial" w:hAnsi="Arial" w:cs="Arial"/>
-          <w:sz w:val="28"/>
-          <w:szCs w:val="28"/>
-          <w:rtl/>
-        </w:rPr>
-        <w:t xml:space="preserve">الالتزام بحدود المساحة المؤجرة، وعدم وضع أي مواد او أغراض خارج حدود المساحة المؤجرة. </w:t>
-      </w:r>
-      <w:r>
-        <w:rPr>
-          <w:sz w:val="28"/>
-          <w:szCs w:val="28"/>
-          <w:rtl/>
-        </w:rPr>
-        <w:t xml:space="preserve"> </w:t>
-      </w:r>
-    </w:p>
-    <w:p>
-      <w:pPr>
-        <w:bidi w:val="0"/>
-        <w:spacing w:after="164"/>
-        <w:ind w:right="103"/>
-      </w:pPr>
-      <w:r>
-        <w:rPr>
-          <w:sz w:val="28"/>
-        </w:rPr>
-        <w:t xml:space="preserve"> </w:t>
+        <w:jc w:val="left"/>
+      </w:pPr>
+      <w:r>
+        <w:rPr>
+          <w:rFonts w:ascii="Arial" w:eastAsia="Arial" w:hAnsi="Arial" w:cs="Arial"/>
+          <w:sz w:val="28"/>
+          <w:szCs w:val="28"/>
+          <w:rtl/>
+        </w:rPr>
+        <w:t>الالتزام بحدود المساحة المؤجرة، وعدم وضع أي مواد او أغراض خارج حدود المساحة المؤجرة.</w:t>
       </w:r>
     </w:p>
     <w:p>
@@ -1908,7 +1648,6 @@
           <w:szCs w:val="28"/>
           <w:rtl/>
         </w:rPr>
-        <w:lastRenderedPageBreak/>
         <w:t>المادة</w:t>
       </w:r>
       <w:r>
@@ -1943,16 +1682,6 @@
           <w:rtl/>
         </w:rPr>
         <w:t>: التجهيزات والديكور</w:t>
-      </w:r>
-      <w:r>
-        <w:rPr>
-          <w:b/>
-          <w:bCs/>
-          <w:sz w:val="28"/>
-          <w:szCs w:val="28"/>
-          <w:rtl/>
-        </w:rPr>
-        <w:t xml:space="preserve"> </w:t>
       </w:r>
     </w:p>
     <w:p>
@@ -1963,7 +1692,7 @@
         </w:numPr>
         <w:spacing w:after="174" w:line="260" w:lineRule="auto"/>
         <w:ind w:right="400" w:hanging="363"/>
-        <w:jc w:val="both"/>
+        <w:jc w:val="left"/>
       </w:pPr>
       <w:r>
         <w:rPr>
@@ -2011,7 +1740,7 @@
           <w:szCs w:val="28"/>
           <w:rtl/>
         </w:rPr>
-        <w:t xml:space="preserve">. </w:t>
+        <w:t>.</w:t>
       </w:r>
     </w:p>
     <w:p>
@@ -2022,24 +1751,16 @@
         </w:numPr>
         <w:spacing w:after="174" w:line="260" w:lineRule="auto"/>
         <w:ind w:right="400" w:hanging="363"/>
-        <w:jc w:val="both"/>
-      </w:pPr>
-      <w:r>
-        <w:rPr>
-          <w:rFonts w:ascii="Arial" w:eastAsia="Arial" w:hAnsi="Arial" w:cs="Arial"/>
-          <w:sz w:val="28"/>
-          <w:szCs w:val="28"/>
-          <w:rtl/>
-        </w:rPr>
-        <w:t xml:space="preserve">لا يحق للطرف الثاني ثقب او حفر أو إجراء أي تعديلات على المساحة المستأجرة أو استخدام الملصقات على الجدران دون أخذ الموافقة الكتابية من الطرف الأول. </w:t>
-      </w:r>
-      <w:r>
-        <w:rPr>
-          <w:sz w:val="28"/>
-          <w:szCs w:val="28"/>
-          <w:rtl/>
-        </w:rPr>
-        <w:t xml:space="preserve"> </w:t>
+        <w:jc w:val="left"/>
+      </w:pPr>
+      <w:r>
+        <w:rPr>
+          <w:rFonts w:ascii="Arial" w:eastAsia="Arial" w:hAnsi="Arial" w:cs="Arial"/>
+          <w:sz w:val="28"/>
+          <w:szCs w:val="28"/>
+          <w:rtl/>
+        </w:rPr>
+        <w:t>لا يحق للطرف الثاني ثقب او حفر أو إجراء أي تعديلات على المساحة المستأجرة أو استخدام الملصقات على الجدران دون أخذ الموافقة الكتابية من الطرف الأول.</w:t>
       </w:r>
     </w:p>
     <w:p>
@@ -2050,15 +1771,16 @@
         </w:numPr>
         <w:spacing w:after="174" w:line="260" w:lineRule="auto"/>
         <w:ind w:right="400" w:hanging="363"/>
-        <w:jc w:val="both"/>
-      </w:pPr>
-      <w:r>
-        <w:rPr>
-          <w:rFonts w:ascii="Arial" w:eastAsia="Arial" w:hAnsi="Arial" w:cs="Arial"/>
-          <w:sz w:val="28"/>
-          <w:szCs w:val="28"/>
-          <w:rtl/>
-        </w:rPr>
+        <w:jc w:val="left"/>
+      </w:pPr>
+      <w:r>
+        <w:rPr>
+          <w:rFonts w:ascii="Arial" w:eastAsia="Arial" w:hAnsi="Arial" w:cs="Arial"/>
+          <w:sz w:val="28"/>
+          <w:szCs w:val="28"/>
+          <w:rtl/>
+        </w:rPr>
+        <w:lastRenderedPageBreak/>
         <w:t xml:space="preserve">يتحمل </w:t>
       </w:r>
       <w:r>
@@ -2107,20 +1829,7 @@
           <w:szCs w:val="28"/>
           <w:rtl/>
         </w:rPr>
-        <w:t xml:space="preserve">. </w:t>
-      </w:r>
-    </w:p>
-    <w:p>
-      <w:pPr>
-        <w:bidi w:val="0"/>
-        <w:spacing w:after="163"/>
-        <w:ind w:right="103"/>
-      </w:pPr>
-      <w:r>
-        <w:rPr>
-          <w:sz w:val="28"/>
-        </w:rPr>
-        <w:t xml:space="preserve"> </w:t>
+        <w:t>.</w:t>
       </w:r>
     </w:p>
     <w:p>
@@ -2192,16 +1901,6 @@
         </w:rPr>
         <w:t>: فسخ العقد</w:t>
       </w:r>
-      <w:r>
-        <w:rPr>
-          <w:b/>
-          <w:bCs/>
-          <w:sz w:val="28"/>
-          <w:szCs w:val="28"/>
-          <w:rtl/>
-        </w:rPr>
-        <w:t xml:space="preserve"> </w:t>
-      </w:r>
     </w:p>
     <w:p>
       <w:pPr>
@@ -2264,7 +1963,7 @@
           <w:szCs w:val="28"/>
           <w:rtl/>
         </w:rPr>
-        <w:t xml:space="preserve">: </w:t>
+        <w:t>:</w:t>
       </w:r>
     </w:p>
     <w:p>
@@ -2284,15 +1983,7 @@
           <w:szCs w:val="28"/>
           <w:rtl/>
         </w:rPr>
-        <w:t xml:space="preserve">وجود خلل في سير العمل. </w:t>
-      </w:r>
-      <w:r>
-        <w:rPr>
-          <w:sz w:val="28"/>
-          <w:szCs w:val="28"/>
-          <w:rtl/>
-        </w:rPr>
-        <w:t xml:space="preserve"> </w:t>
+        <w:t>وجود خلل في سير العمل.</w:t>
       </w:r>
     </w:p>
     <w:p>
@@ -2312,15 +2003,7 @@
           <w:szCs w:val="28"/>
           <w:rtl/>
         </w:rPr>
-        <w:t xml:space="preserve">مخالفة الطرف الثاني لتعليمات المعرض. </w:t>
-      </w:r>
-      <w:r>
-        <w:rPr>
-          <w:sz w:val="28"/>
-          <w:szCs w:val="28"/>
-          <w:rtl/>
-        </w:rPr>
-        <w:t xml:space="preserve"> </w:t>
+        <w:t>مخالفة الطرف الثاني لتعليمات المعرض.</w:t>
       </w:r>
     </w:p>
     <w:p>
@@ -2348,7 +2031,7 @@
           <w:szCs w:val="28"/>
           <w:rtl/>
         </w:rPr>
-        <w:t xml:space="preserve">. </w:t>
+        <w:t>.</w:t>
       </w:r>
     </w:p>
     <w:p>
@@ -2385,23 +2068,6 @@
         </w:rPr>
         <w:t>.</w:t>
       </w:r>
-      <w:r>
-        <w:rPr>
-          <w:rFonts w:ascii="Arial" w:eastAsia="Arial" w:hAnsi="Arial" w:cs="Arial"/>
-          <w:sz w:val="28"/>
-          <w:szCs w:val="28"/>
-          <w:rtl/>
-        </w:rPr>
-        <w:t xml:space="preserve"> </w:t>
-      </w:r>
-      <w:r>
-        <w:rPr>
-          <w:rFonts w:ascii="Arial" w:eastAsia="Arial" w:hAnsi="Arial" w:cs="Arial"/>
-          <w:b/>
-          <w:sz w:val="28"/>
-        </w:rPr>
-        <w:t xml:space="preserve"> </w:t>
-      </w:r>
     </w:p>
     <w:p>
       <w:pPr>
@@ -2472,16 +2138,6 @@
           <w:rtl/>
         </w:rPr>
         <w:t>: المسؤولية والتعويض</w:t>
-      </w:r>
-      <w:r>
-        <w:rPr>
-          <w:b/>
-          <w:bCs/>
-          <w:sz w:val="28"/>
-          <w:szCs w:val="28"/>
-          <w:rtl/>
-        </w:rPr>
-        <w:t xml:space="preserve"> </w:t>
       </w:r>
     </w:p>
     <w:p>
@@ -2492,7 +2148,7 @@
         </w:numPr>
         <w:spacing w:after="174" w:line="260" w:lineRule="auto"/>
         <w:ind w:right="381" w:hanging="362"/>
-        <w:jc w:val="both"/>
+        <w:jc w:val="left"/>
       </w:pPr>
       <w:r>
         <w:rPr>
@@ -2529,7 +2185,7 @@
           <w:szCs w:val="28"/>
           <w:rtl/>
         </w:rPr>
-        <w:t xml:space="preserve">. </w:t>
+        <w:t>.</w:t>
       </w:r>
     </w:p>
     <w:p>
@@ -2540,7 +2196,7 @@
         </w:numPr>
         <w:spacing w:after="174" w:line="260" w:lineRule="auto"/>
         <w:ind w:right="381" w:hanging="362"/>
-        <w:jc w:val="both"/>
+        <w:jc w:val="left"/>
       </w:pPr>
       <w:r>
         <w:rPr>
@@ -2589,23 +2245,35 @@
           <w:szCs w:val="28"/>
           <w:rtl/>
         </w:rPr>
-        <w:t xml:space="preserve"> عن أي أضرار، أو خسائر،  أو مطالبات قضائية، أو إدارية تنتج عن تصرفاته أو إخلاله بالتزاماته</w:t>
-      </w:r>
-      <w:r>
-        <w:rPr>
-          <w:sz w:val="28"/>
-          <w:szCs w:val="28"/>
-          <w:rtl/>
-        </w:rPr>
-        <w:t xml:space="preserve">. </w:t>
-      </w:r>
-      <w:r>
-        <w:rPr>
-          <w:rFonts w:ascii="Arial" w:eastAsia="Arial" w:hAnsi="Arial" w:cs="Arial"/>
-          <w:b/>
-          <w:sz w:val="28"/>
-        </w:rPr>
-        <w:t xml:space="preserve"> </w:t>
+        <w:t xml:space="preserve"> عن أي أضرار، أو </w:t>
+      </w:r>
+      <w:proofErr w:type="gramStart"/>
+      <w:r>
+        <w:rPr>
+          <w:rFonts w:ascii="Arial" w:eastAsia="Arial" w:hAnsi="Arial" w:cs="Arial"/>
+          <w:sz w:val="28"/>
+          <w:szCs w:val="28"/>
+          <w:rtl/>
+        </w:rPr>
+        <w:t>خسائر،  أو</w:t>
+      </w:r>
+      <w:proofErr w:type="gramEnd"/>
+      <w:r>
+        <w:rPr>
+          <w:rFonts w:ascii="Arial" w:eastAsia="Arial" w:hAnsi="Arial" w:cs="Arial"/>
+          <w:sz w:val="28"/>
+          <w:szCs w:val="28"/>
+          <w:rtl/>
+        </w:rPr>
+        <w:t xml:space="preserve"> مطالبات قضائية، أو إدارية تنتج عن تصرفاته أو إخلاله بالتزاماته</w:t>
+      </w:r>
+      <w:r>
+        <w:rPr>
+          <w:sz w:val="28"/>
+          <w:szCs w:val="28"/>
+          <w:rtl/>
+        </w:rPr>
+        <w:t>.</w:t>
       </w:r>
     </w:p>
     <w:p>
@@ -2678,16 +2346,6 @@
         </w:rPr>
         <w:t>: القوة القاهر ة</w:t>
       </w:r>
-      <w:r>
-        <w:rPr>
-          <w:b/>
-          <w:bCs/>
-          <w:sz w:val="28"/>
-          <w:szCs w:val="28"/>
-          <w:rtl/>
-        </w:rPr>
-        <w:t xml:space="preserve"> </w:t>
-      </w:r>
     </w:p>
     <w:p>
       <w:pPr>
@@ -2710,7 +2368,7 @@
           <w:szCs w:val="28"/>
           <w:rtl/>
         </w:rPr>
-        <w:t xml:space="preserve">. </w:t>
+        <w:t>.</w:t>
       </w:r>
     </w:p>
     <w:p>
@@ -2754,21 +2412,7 @@
           <w:szCs w:val="28"/>
           <w:rtl/>
         </w:rPr>
-        <w:t xml:space="preserve">. </w:t>
-      </w:r>
-    </w:p>
-    <w:p>
-      <w:pPr>
-        <w:bidi w:val="0"/>
-        <w:spacing w:after="168"/>
-        <w:ind w:right="77"/>
-      </w:pPr>
-      <w:r>
-        <w:rPr>
-          <w:rFonts w:ascii="Arial" w:eastAsia="Arial" w:hAnsi="Arial" w:cs="Arial"/>
-          <w:sz w:val="28"/>
-        </w:rPr>
-        <w:t xml:space="preserve"> </w:t>
+        <w:t>.</w:t>
       </w:r>
     </w:p>
     <w:p>
@@ -2853,31 +2497,20 @@
         </w:rPr>
         <w:t>ة</w:t>
       </w:r>
-      <w:r>
-        <w:rPr>
-          <w:b/>
-          <w:bCs/>
-          <w:sz w:val="28"/>
-          <w:szCs w:val="28"/>
-          <w:rtl/>
-        </w:rPr>
-        <w:t xml:space="preserve"> </w:t>
-      </w:r>
     </w:p>
     <w:p>
       <w:pPr>
         <w:spacing w:after="174" w:line="260" w:lineRule="auto"/>
         <w:ind w:left="4" w:right="274" w:hanging="4"/>
-        <w:jc w:val="both"/>
-      </w:pPr>
-      <w:r>
-        <w:rPr>
-          <w:rFonts w:ascii="Arial" w:eastAsia="Arial" w:hAnsi="Arial" w:cs="Arial"/>
-          <w:sz w:val="28"/>
-          <w:szCs w:val="28"/>
-          <w:rtl/>
-        </w:rPr>
-        <w:lastRenderedPageBreak/>
+        <w:jc w:val="left"/>
+      </w:pPr>
+      <w:r>
+        <w:rPr>
+          <w:rFonts w:ascii="Arial" w:eastAsia="Arial" w:hAnsi="Arial" w:cs="Arial"/>
+          <w:sz w:val="28"/>
+          <w:szCs w:val="28"/>
+          <w:rtl/>
+        </w:rPr>
         <w:t xml:space="preserve">تعود ملكية جميع الصور والفيديوهات والمحتوى الإعلامي المصوّر داخل المعرض إلى </w:t>
       </w:r>
       <w:r>
@@ -2926,20 +2559,7 @@
           <w:szCs w:val="28"/>
           <w:rtl/>
         </w:rPr>
-        <w:t xml:space="preserve">. </w:t>
-      </w:r>
-    </w:p>
-    <w:p>
-      <w:pPr>
-        <w:bidi w:val="0"/>
-        <w:spacing w:after="163"/>
-        <w:ind w:right="103"/>
-      </w:pPr>
-      <w:r>
-        <w:rPr>
-          <w:sz w:val="28"/>
-        </w:rPr>
-        <w:t xml:space="preserve"> </w:t>
+        <w:t>.</w:t>
       </w:r>
     </w:p>
     <w:p>
@@ -3034,22 +2654,12 @@
         </w:rPr>
         <w:t xml:space="preserve"> القضائي</w:t>
       </w:r>
-      <w:r>
-        <w:rPr>
-          <w:b/>
-          <w:bCs/>
-          <w:sz w:val="28"/>
-          <w:szCs w:val="28"/>
-          <w:rtl/>
-        </w:rPr>
-        <w:t xml:space="preserve"> </w:t>
-      </w:r>
     </w:p>
     <w:p>
       <w:pPr>
         <w:spacing w:after="174" w:line="260" w:lineRule="auto"/>
         <w:ind w:left="4" w:right="400" w:hanging="4"/>
-        <w:jc w:val="both"/>
+        <w:jc w:val="left"/>
       </w:pPr>
       <w:r>
         <w:rPr>
@@ -3093,24 +2703,8 @@
         <w:rPr>
           <w:sz w:val="28"/>
           <w:szCs w:val="28"/>
-          <w:rtl/>
-        </w:rPr>
-        <w:t xml:space="preserve">. </w:t>
-      </w:r>
-    </w:p>
-    <w:p>
-      <w:pPr>
-        <w:bidi w:val="0"/>
-        <w:spacing w:after="168"/>
-        <w:ind w:right="82"/>
-      </w:pPr>
-      <w:r>
-        <w:rPr>
-          <w:rFonts w:ascii="Arial" w:eastAsia="Arial" w:hAnsi="Arial" w:cs="Arial"/>
-          <w:b/>
-          <w:sz w:val="28"/>
-        </w:rPr>
-        <w:t xml:space="preserve"> </w:t>
+        </w:rPr>
+        <w:t>.</w:t>
       </w:r>
     </w:p>
     <w:p>
@@ -3193,16 +2787,6 @@
           <w:rtl/>
         </w:rPr>
         <w:t>ة</w:t>
-      </w:r>
-      <w:r>
-        <w:rPr>
-          <w:b/>
-          <w:bCs/>
-          <w:sz w:val="28"/>
-          <w:szCs w:val="28"/>
-          <w:rtl/>
-        </w:rPr>
-        <w:t xml:space="preserve"> </w:t>
       </w:r>
     </w:p>
     <w:p>
@@ -3228,6 +2812,7 @@
           <w:szCs w:val="26"/>
           <w:rtl/>
         </w:rPr>
+        <w:lastRenderedPageBreak/>
         <w:t>يشكل هذا العقد كامل الاتفاق بين الطرفين، ويلغي ما عداه من اتفاقات أو مراسلات سابقة، سواء كانت مكتوبة أو شفهية</w:t>
       </w:r>
       <w:r>
@@ -3352,27 +2937,17 @@
           <w:szCs w:val="26"/>
           <w:rtl/>
         </w:rPr>
-        <w:t>لا يعتمد هذا العقد وتسقط مسؤولية الطرف الأول تجاه الطرف الثاني في حال لم يتم تحويل كامل المبلغ المستحق .</w:t>
-      </w:r>
-    </w:p>
-    <w:p>
-      <w:pPr>
-        <w:bidi w:val="0"/>
-        <w:spacing w:after="167"/>
-        <w:ind w:right="791"/>
-        <w:rPr>
-          <w:b/>
-          <w:bCs/>
-        </w:rPr>
-      </w:pPr>
+        <w:t>لا يعتمد هذا العقد وتسقط مسؤولية الطرف الأول تجاه الطرف الثاني في حال لم يتم تحويل كامل المبلغ المستحق</w:t>
+      </w:r>
       <w:r>
         <w:rPr>
           <w:rFonts w:ascii="Arial" w:eastAsia="Arial" w:hAnsi="Arial" w:cs="Arial"/>
           <w:b/>
           <w:bCs/>
           <w:sz w:val="26"/>
-        </w:rPr>
-        <w:t xml:space="preserve"> </w:t>
+          <w:szCs w:val="26"/>
+        </w:rPr>
+        <w:t>.</w:t>
       </w:r>
     </w:p>
     <w:p>

</xml_diff>

<commit_message>
improved generated pdf file
</commit_message>
<xml_diff>
--- a/public/contract.docx
+++ b/public/contract.docx
@@ -829,7 +829,7 @@
           <w:szCs w:val="28"/>
           <w:rtl/>
         </w:rPr>
-        <w:t>.</w:t>
+        <w:t xml:space="preserve"> </w:t>
       </w:r>
     </w:p>
     <w:p>
@@ -1080,7 +1080,7 @@
           <w:szCs w:val="28"/>
           <w:rtl/>
         </w:rPr>
-        <w:t>.</w:t>
+        <w:t xml:space="preserve"> </w:t>
       </w:r>
     </w:p>
     <w:p>
@@ -1207,7 +1207,7 @@
           <w:szCs w:val="28"/>
           <w:rtl/>
         </w:rPr>
-        <w:t>.</w:t>
+        <w:t xml:space="preserve"> </w:t>
       </w:r>
     </w:p>
     <w:p>
@@ -1232,7 +1232,16 @@
           <w:szCs w:val="28"/>
           <w:rtl/>
         </w:rPr>
-        <w:t>يجب تحويل المدفوعات صافية من أي رسوم بنكية او ضرائب.</w:t>
+        <w:t>يجب تحويل المدفوعات صافية من أي رسوم بنكية او ضرائب</w:t>
+      </w:r>
+      <w:r>
+        <w:rPr>
+          <w:rFonts w:asciiTheme="majorBidi" w:eastAsia="Arial" w:hAnsiTheme="majorBidi" w:cstheme="majorBidi"/>
+          <w:sz w:val="28"/>
+          <w:szCs w:val="28"/>
+          <w:rtl/>
+        </w:rPr>
+        <w:t xml:space="preserve"> </w:t>
       </w:r>
     </w:p>
     <w:p>
@@ -1266,7 +1275,7 @@
           <w:szCs w:val="28"/>
           <w:rtl/>
         </w:rPr>
-        <w:t>.</w:t>
+        <w:t xml:space="preserve"> </w:t>
       </w:r>
     </w:p>
     <w:p>
@@ -1300,7 +1309,7 @@
           <w:szCs w:val="28"/>
           <w:rtl/>
         </w:rPr>
-        <w:t>.</w:t>
+        <w:t xml:space="preserve"> </w:t>
       </w:r>
     </w:p>
     <w:p>
@@ -1348,6 +1357,7 @@
         </w:rPr>
         <w:t>(</w:t>
       </w:r>
+      <w:proofErr w:type="spellStart"/>
       <w:r>
         <w:rPr>
           <w:rFonts w:asciiTheme="majorBidi" w:hAnsiTheme="majorBidi" w:cstheme="majorBidi"/>
@@ -1356,8 +1366,31 @@
           <w:szCs w:val="28"/>
           <w:u w:val="single" w:color="0563C1"/>
         </w:rPr>
-        <w:t>finance@umbrella.sa</w:t>
-      </w:r>
+        <w:t>finance@umbrella</w:t>
+      </w:r>
+      <w:proofErr w:type="spellEnd"/>
+      <w:r>
+        <w:rPr>
+          <w:rFonts w:asciiTheme="majorBidi" w:hAnsiTheme="majorBidi" w:cstheme="majorBidi"/>
+          <w:color w:val="0563C1"/>
+          <w:sz w:val="28"/>
+          <w:szCs w:val="28"/>
+          <w:u w:val="single" w:color="0563C1"/>
+        </w:rPr>
+        <w:t xml:space="preserve"> </w:t>
+      </w:r>
+      <w:proofErr w:type="spellStart"/>
+      <w:r>
+        <w:rPr>
+          <w:rFonts w:asciiTheme="majorBidi" w:hAnsiTheme="majorBidi" w:cstheme="majorBidi"/>
+          <w:color w:val="0563C1"/>
+          <w:sz w:val="28"/>
+          <w:szCs w:val="28"/>
+          <w:u w:val="single" w:color="0563C1"/>
+        </w:rPr>
+        <w:t>sa</w:t>
+      </w:r>
+      <w:proofErr w:type="spellEnd"/>
       <w:r>
         <w:rPr>
           <w:rFonts w:asciiTheme="majorBidi" w:eastAsia="Arial" w:hAnsiTheme="majorBidi" w:cstheme="majorBidi"/>
@@ -1367,7 +1400,6 @@
         </w:rPr>
         <w:t xml:space="preserve">)، وإلا سيعتبر الحجز </w:t>
       </w:r>
-      <w:proofErr w:type="gramStart"/>
       <w:r>
         <w:rPr>
           <w:rFonts w:asciiTheme="majorBidi" w:eastAsia="Arial" w:hAnsiTheme="majorBidi" w:cstheme="majorBidi"/>
@@ -1394,9 +1426,17 @@
           <w:szCs w:val="28"/>
           <w:rtl/>
         </w:rPr>
-        <w:t xml:space="preserve"> .</w:t>
-      </w:r>
-      <w:proofErr w:type="gramEnd"/>
+        <w:t xml:space="preserve"> </w:t>
+      </w:r>
+      <w:r>
+        <w:rPr>
+          <w:rFonts w:asciiTheme="majorBidi" w:eastAsia="Arial" w:hAnsiTheme="majorBidi" w:cstheme="majorBidi"/>
+          <w:sz w:val="28"/>
+          <w:szCs w:val="28"/>
+          <w:rtl/>
+        </w:rPr>
+        <w:t xml:space="preserve"> </w:t>
+      </w:r>
     </w:p>
     <w:p>
       <w:pPr>
@@ -1504,7 +1544,7 @@
           <w:szCs w:val="28"/>
           <w:rtl/>
         </w:rPr>
-        <w:t>.</w:t>
+        <w:t xml:space="preserve"> </w:t>
       </w:r>
     </w:p>
     <w:p>
@@ -1538,7 +1578,7 @@
           <w:szCs w:val="28"/>
           <w:rtl/>
         </w:rPr>
-        <w:t>.</w:t>
+        <w:t xml:space="preserve"> </w:t>
       </w:r>
     </w:p>
     <w:p>
@@ -1572,7 +1612,7 @@
           <w:szCs w:val="28"/>
           <w:rtl/>
         </w:rPr>
-        <w:t>.</w:t>
+        <w:t xml:space="preserve"> </w:t>
       </w:r>
     </w:p>
     <w:p>
@@ -1606,7 +1646,7 @@
           <w:szCs w:val="28"/>
           <w:rtl/>
         </w:rPr>
-        <w:t>.</w:t>
+        <w:t xml:space="preserve"> </w:t>
       </w:r>
     </w:p>
     <w:p>
@@ -1640,7 +1680,7 @@
           <w:szCs w:val="28"/>
           <w:rtl/>
         </w:rPr>
-        <w:t>.</w:t>
+        <w:t xml:space="preserve"> </w:t>
       </w:r>
     </w:p>
     <w:p>
@@ -1665,7 +1705,16 @@
           <w:szCs w:val="28"/>
           <w:rtl/>
         </w:rPr>
-        <w:t>الالتزام بحدود المساحة المؤجرة، وعدم وضع أي مواد او أغراض خارج حدود المساحة المؤجرة.</w:t>
+        <w:t>الالتزام بحدود المساحة المؤجرة، وعدم وضع أي مواد او أغراض خارج حدود المساحة المؤجرة</w:t>
+      </w:r>
+      <w:r>
+        <w:rPr>
+          <w:rFonts w:asciiTheme="majorBidi" w:eastAsia="Arial" w:hAnsiTheme="majorBidi" w:cstheme="majorBidi"/>
+          <w:sz w:val="28"/>
+          <w:szCs w:val="28"/>
+          <w:rtl/>
+        </w:rPr>
+        <w:t xml:space="preserve"> </w:t>
       </w:r>
     </w:p>
     <w:p>
@@ -1755,7 +1804,7 @@
           <w:szCs w:val="28"/>
           <w:rtl/>
         </w:rPr>
-        <w:t>.</w:t>
+        <w:t xml:space="preserve"> </w:t>
       </w:r>
     </w:p>
     <w:p>
@@ -1780,7 +1829,16 @@
           <w:szCs w:val="28"/>
           <w:rtl/>
         </w:rPr>
-        <w:t>لا يحق للطرف الثاني ثقب او حفر أو إجراء أي تعديلات على المساحة المستأجرة أو استخدام الملصقات على الجدران دون أخذ الموافقة الكتابية من الطرف الأول.</w:t>
+        <w:t>لا يحق للطرف الثاني ثقب او حفر أو إجراء أي تعديلات على المساحة المستأجرة أو استخدام الملصقات على الجدران دون أخذ الموافقة الكتابية من الطرف الأول</w:t>
+      </w:r>
+      <w:r>
+        <w:rPr>
+          <w:rFonts w:asciiTheme="majorBidi" w:eastAsia="Arial" w:hAnsiTheme="majorBidi" w:cstheme="majorBidi"/>
+          <w:sz w:val="28"/>
+          <w:szCs w:val="28"/>
+          <w:rtl/>
+        </w:rPr>
+        <w:t xml:space="preserve"> </w:t>
       </w:r>
     </w:p>
     <w:p>
@@ -1815,7 +1873,7 @@
           <w:szCs w:val="28"/>
           <w:rtl/>
         </w:rPr>
-        <w:t>.</w:t>
+        <w:t xml:space="preserve"> </w:t>
       </w:r>
     </w:p>
     <w:p>
@@ -1946,7 +2004,16 @@
           <w:szCs w:val="28"/>
           <w:rtl/>
         </w:rPr>
-        <w:t>وجود خلل في سير العمل.</w:t>
+        <w:t>وجود خلل في سير العمل</w:t>
+      </w:r>
+      <w:r>
+        <w:rPr>
+          <w:rFonts w:asciiTheme="majorBidi" w:eastAsia="Arial" w:hAnsiTheme="majorBidi" w:cstheme="majorBidi"/>
+          <w:sz w:val="28"/>
+          <w:szCs w:val="28"/>
+          <w:rtl/>
+        </w:rPr>
+        <w:t xml:space="preserve"> </w:t>
       </w:r>
     </w:p>
     <w:p>
@@ -1971,7 +2038,16 @@
           <w:szCs w:val="28"/>
           <w:rtl/>
         </w:rPr>
-        <w:t>مخالفة الطرف الثاني لتعليمات المعرض.</w:t>
+        <w:t>مخالفة الطرف الثاني لتعليمات المعرض</w:t>
+      </w:r>
+      <w:r>
+        <w:rPr>
+          <w:rFonts w:asciiTheme="majorBidi" w:eastAsia="Arial" w:hAnsiTheme="majorBidi" w:cstheme="majorBidi"/>
+          <w:sz w:val="28"/>
+          <w:szCs w:val="28"/>
+          <w:rtl/>
+        </w:rPr>
+        <w:t xml:space="preserve"> </w:t>
       </w:r>
     </w:p>
     <w:p>
@@ -2005,7 +2081,7 @@
           <w:szCs w:val="28"/>
           <w:rtl/>
         </w:rPr>
-        <w:t>.</w:t>
+        <w:t xml:space="preserve"> </w:t>
       </w:r>
     </w:p>
     <w:p>
@@ -2035,7 +2111,7 @@
           <w:szCs w:val="28"/>
           <w:rtl/>
         </w:rPr>
-        <w:t>.</w:t>
+        <w:t xml:space="preserve"> </w:t>
       </w:r>
     </w:p>
     <w:p>
@@ -2146,7 +2222,7 @@
           <w:szCs w:val="28"/>
           <w:rtl/>
         </w:rPr>
-        <w:t>.</w:t>
+        <w:t xml:space="preserve"> </w:t>
       </w:r>
     </w:p>
     <w:p>
@@ -2200,7 +2276,7 @@
           <w:szCs w:val="28"/>
           <w:rtl/>
         </w:rPr>
-        <w:t>.</w:t>
+        <w:t xml:space="preserve"> </w:t>
       </w:r>
     </w:p>
     <w:p>
@@ -2307,7 +2383,7 @@
           <w:szCs w:val="28"/>
           <w:rtl/>
         </w:rPr>
-        <w:t>.</w:t>
+        <w:t xml:space="preserve"> </w:t>
       </w:r>
     </w:p>
     <w:p>
@@ -2337,7 +2413,7 @@
           <w:szCs w:val="28"/>
           <w:rtl/>
         </w:rPr>
-        <w:t>.</w:t>
+        <w:t xml:space="preserve"> </w:t>
       </w:r>
     </w:p>
     <w:p>
@@ -2456,7 +2532,7 @@
           <w:szCs w:val="28"/>
           <w:rtl/>
         </w:rPr>
-        <w:t>.</w:t>
+        <w:t xml:space="preserve"> </w:t>
       </w:r>
     </w:p>
     <w:p>
@@ -2601,8 +2677,9 @@
           <w:rFonts w:asciiTheme="majorBidi" w:hAnsiTheme="majorBidi" w:cstheme="majorBidi"/>
           <w:sz w:val="28"/>
           <w:szCs w:val="28"/>
-        </w:rPr>
-        <w:t>.</w:t>
+          <w:rtl/>
+        </w:rPr>
+        <w:t xml:space="preserve"> </w:t>
       </w:r>
     </w:p>
     <w:p>
@@ -2724,7 +2801,7 @@
           <w:szCs w:val="28"/>
           <w:rtl/>
         </w:rPr>
-        <w:t>.</w:t>
+        <w:t xml:space="preserve"> </w:t>
       </w:r>
     </w:p>
     <w:p>
@@ -2759,7 +2836,7 @@
           <w:szCs w:val="28"/>
           <w:rtl/>
         </w:rPr>
-        <w:t>.</w:t>
+        <w:t xml:space="preserve"> </w:t>
       </w:r>
     </w:p>
     <w:p>
@@ -2784,7 +2861,16 @@
           <w:szCs w:val="28"/>
           <w:rtl/>
         </w:rPr>
-        <w:t>حرر هذا العقد إلكترونيا بناء على ما قدمه الطرف الثاني من بيانات، ولا يسقط حق الطرف الأول لأي خطاء في البيانات المقدمة.</w:t>
+        <w:t>حرر هذا العقد إلكترونيا بناء على ما قدمه الطرف الثاني من بيانات، ولا يسقط حق الطرف الأول لأي خطاء في البيانات المقدمة</w:t>
+      </w:r>
+      <w:r>
+        <w:rPr>
+          <w:rFonts w:asciiTheme="majorBidi" w:eastAsia="Arial" w:hAnsiTheme="majorBidi" w:cstheme="majorBidi"/>
+          <w:sz w:val="28"/>
+          <w:szCs w:val="28"/>
+          <w:rtl/>
+        </w:rPr>
+        <w:t xml:space="preserve"> </w:t>
       </w:r>
     </w:p>
     <w:p>
@@ -2809,7 +2895,16 @@
           <w:szCs w:val="28"/>
           <w:rtl/>
         </w:rPr>
-        <w:t>يعد اصدار هذا العقد وتحويل مبلغ المساحة بمثابة موافقة إلكترونية بكافة ما ورد في بنوده، وإقرارا من الطرف الثاني بما ورد فيه.</w:t>
+        <w:t>يعد اصدار هذا العقد وتحويل مبلغ المساحة بمثابة موافقة إلكترونية بكافة ما ورد في بنوده، وإقرارا من الطرف الثاني بما ورد فيه</w:t>
+      </w:r>
+      <w:r>
+        <w:rPr>
+          <w:rFonts w:asciiTheme="majorBidi" w:eastAsia="Arial" w:hAnsiTheme="majorBidi" w:cstheme="majorBidi"/>
+          <w:sz w:val="28"/>
+          <w:szCs w:val="28"/>
+          <w:rtl/>
+        </w:rPr>
+        <w:t xml:space="preserve"> </w:t>
       </w:r>
     </w:p>
     <w:p>
@@ -2841,8 +2936,9 @@
           <w:rFonts w:asciiTheme="majorBidi" w:eastAsia="Arial" w:hAnsiTheme="majorBidi" w:cstheme="majorBidi"/>
           <w:sz w:val="28"/>
           <w:szCs w:val="28"/>
-        </w:rPr>
-        <w:t>.</w:t>
+          <w:rtl/>
+        </w:rPr>
+        <w:t xml:space="preserve"> </w:t>
       </w:r>
     </w:p>
     <w:p>
@@ -2867,7 +2963,18 @@
           <w:szCs w:val="28"/>
           <w:rtl/>
         </w:rPr>
-        <w:t>هذا والله ولي التوفيق...</w:t>
+        <w:t>هذا والله ولي التوفيق</w:t>
+      </w:r>
+      <w:r>
+        <w:rPr>
+          <w:rFonts w:asciiTheme="majorBidi" w:eastAsia="Arial" w:hAnsiTheme="majorBidi" w:cstheme="majorBidi"/>
+          <w:b/>
+          <w:bCs/>
+          <w:sz w:val="28"/>
+          <w:szCs w:val="28"/>
+          <w:rtl/>
+        </w:rPr>
+        <w:t xml:space="preserve">   </w:t>
       </w:r>
     </w:p>
     <w:p>

</xml_diff>

<commit_message>
pdf generation from form page works perfectly
</commit_message>
<xml_diff>
--- a/public/contract.docx
+++ b/public/contract.docx
@@ -54,7 +54,7 @@
             </w:pPr>
             <w:r>
               <w:drawing>
-                <wp:inline wp14:editId="6F171660" wp14:anchorId="4BADD35E">
+                <wp:inline wp14:editId="26FC6C2B" wp14:anchorId="4BADD35E">
                   <wp:extent cx="2062595" cy="803564"/>
                   <wp:effectExtent l="0" t="0" r="0" b="0"/>
                   <wp:docPr id="729708804" name="Picture 1" descr="A logo with purple letters and numbers&#10;&#10;AI-generated content may be incorrect."/>
@@ -137,7 +137,7 @@
             </w:pPr>
             <w:r>
               <w:drawing>
-                <wp:inline wp14:editId="13D69CD0" wp14:anchorId="4FA9C1C2">
+                <wp:inline wp14:editId="72357139" wp14:anchorId="4FA9C1C2">
                   <wp:extent cx="1432560" cy="381000"/>
                   <wp:effectExtent l="0" t="0" r="0" b="0"/>
                   <wp:docPr id="745537985" name="Picture 734064909" descr="Background pattern&#10;&#10;Description automatically generated with low confidence"/>
@@ -203,7 +203,7 @@
             </w:pPr>
             <w:r>
               <w:drawing>
-                <wp:inline wp14:editId="2293C72A" wp14:anchorId="19BFC17D">
+                <wp:inline wp14:editId="62EF06B7" wp14:anchorId="19BFC17D">
                   <wp:extent cx="1905000" cy="732155"/>
                   <wp:effectExtent l="0" t="0" r="0" b="0"/>
                   <wp:docPr id="1906785383" name="Picture 1157273046" descr="Background pattern&#10;&#10;Description automatically generated with low confidence"/>
@@ -674,6 +674,163 @@
     </w:p>
     <w:p>
       <w:pPr>
+        <w:bidi w:val="0"/>
+        <w:spacing w:after="0"/>
+        <w:jc w:val="center"/>
+        <w:rPr>
+          <w:rFonts w:ascii="Arial" w:hAnsi="Arial" w:eastAsia="Arial" w:cs="Arial"/>
+          <w:noProof w:val="0"/>
+          <w:sz w:val="28"/>
+          <w:szCs w:val="28"/>
+          <w:lang w:val="en-US"/>
+        </w:rPr>
+      </w:pPr>
+      <w:r>
+        <w:rPr>
+          <w:rFonts w:ascii="Arial" w:hAnsi="Arial" w:eastAsia="Arial" w:cs="Arial"/>
+          <w:noProof w:val="0"/>
+          <w:sz w:val="28"/>
+          <w:szCs w:val="28"/>
+          <w:lang w:val="en-US"/>
+        </w:rPr>
+        <w:t>${organization}</w:t>
+      </w:r>
+    </w:p>
+    <w:p>
+      <w:pPr>
+        <w:bidi w:val="1"/>
+        <w:spacing w:after="0"/>
+        <w:rPr>
+          <w:rFonts w:ascii="Arial" w:hAnsi="Arial" w:eastAsia="Arial" w:cs="Arial"/>
+          <w:b w:val="1"/>
+          <w:bCs w:val="1"/>
+          <w:sz w:val="28"/>
+          <w:szCs w:val="28"/>
+        </w:rPr>
+      </w:pPr>
+    </w:p>
+    <w:p>
+      <w:pPr>
+        <w:bidi w:val="0"/>
+        <w:spacing w:after="0"/>
+        <w:jc w:val="right"/>
+        <w:rPr>
+          <w:rFonts w:ascii="Arial" w:hAnsi="Arial" w:eastAsia="Arial" w:cs="Arial"/>
+          <w:b w:val="1"/>
+          <w:bCs w:val="1"/>
+          <w:sz w:val="28"/>
+          <w:szCs w:val="28"/>
+          <w:rtl w:val="1"/>
+        </w:rPr>
+      </w:pPr>
+      <w:r>
+        <w:rPr>
+          <w:rFonts w:ascii="Arial" w:hAnsi="Arial" w:eastAsia="Arial" w:cs="Arial"/>
+          <w:b w:val="1"/>
+          <w:bCs w:val="1"/>
+          <w:sz w:val="28"/>
+          <w:szCs w:val="28"/>
+          <w:rtl w:val="1"/>
+        </w:rPr>
+        <w:t>سجل تجاري رقم</w:t>
+      </w:r>
+      <w:r>
+        <w:rPr>
+          <w:rFonts w:ascii="Arial" w:hAnsi="Arial" w:eastAsia="Arial" w:cs="Arial"/>
+          <w:b w:val="1"/>
+          <w:bCs w:val="1"/>
+          <w:sz w:val="28"/>
+          <w:szCs w:val="28"/>
+        </w:rPr>
+        <w:t xml:space="preserve">: </w:t>
+      </w:r>
+    </w:p>
+    <w:p>
+      <w:pPr>
+        <w:bidi w:val="0"/>
+        <w:spacing w:after="0"/>
+        <w:jc w:val="center"/>
+        <w:rPr>
+          <w:rFonts w:ascii="Arial" w:hAnsi="Arial" w:eastAsia="Arial" w:cs="Arial"/>
+          <w:noProof w:val="0"/>
+          <w:sz w:val="28"/>
+          <w:szCs w:val="28"/>
+          <w:lang w:val="en-US"/>
+        </w:rPr>
+      </w:pPr>
+      <w:r>
+        <w:rPr>
+          <w:rFonts w:ascii="Arial" w:hAnsi="Arial" w:eastAsia="Arial" w:cs="Arial"/>
+          <w:noProof w:val="0"/>
+          <w:sz w:val="28"/>
+          <w:szCs w:val="28"/>
+          <w:lang w:val="en-US"/>
+        </w:rPr>
+        <w:t>${cr_copy}</w:t>
+      </w:r>
+    </w:p>
+    <w:p>
+      <w:pPr>
+        <w:bidi w:val="0"/>
+        <w:spacing w:after="0"/>
+        <w:jc w:val="right"/>
+        <w:rPr>
+          <w:rFonts w:ascii="Arial" w:hAnsi="Arial" w:eastAsia="Arial" w:cs="Arial"/>
+          <w:b w:val="1"/>
+          <w:bCs w:val="1"/>
+          <w:sz w:val="28"/>
+          <w:szCs w:val="28"/>
+          <w:rtl w:val="1"/>
+        </w:rPr>
+      </w:pPr>
+      <w:r>
+        <w:rPr>
+          <w:rFonts w:ascii="Arial" w:hAnsi="Arial" w:eastAsia="Arial" w:cs="Arial"/>
+          <w:b w:val="1"/>
+          <w:bCs w:val="1"/>
+          <w:sz w:val="28"/>
+          <w:szCs w:val="28"/>
+          <w:rtl w:val="1"/>
+        </w:rPr>
+        <w:t>اسم مقدم الطلب</w:t>
+      </w:r>
+      <w:r>
+        <w:rPr>
+          <w:rFonts w:ascii="Arial" w:hAnsi="Arial" w:eastAsia="Arial" w:cs="Arial"/>
+          <w:b w:val="1"/>
+          <w:bCs w:val="1"/>
+          <w:sz w:val="28"/>
+          <w:szCs w:val="28"/>
+        </w:rPr>
+        <w:t xml:space="preserve">: </w:t>
+      </w:r>
+    </w:p>
+    <w:p>
+      <w:pPr>
+        <w:bidi w:val="0"/>
+        <w:spacing w:after="0"/>
+        <w:jc w:val="center"/>
+        <w:rPr>
+          <w:rFonts w:ascii="Arial" w:hAnsi="Arial" w:eastAsia="Arial" w:cs="Arial"/>
+          <w:noProof w:val="0"/>
+          <w:sz w:val="28"/>
+          <w:szCs w:val="28"/>
+          <w:lang w:val="en-US"/>
+        </w:rPr>
+      </w:pPr>
+      <w:r>
+        <w:rPr>
+          <w:rFonts w:ascii="Arial" w:hAnsi="Arial" w:eastAsia="Arial" w:cs="Arial"/>
+          <w:noProof w:val="0"/>
+          <w:sz w:val="28"/>
+          <w:szCs w:val="28"/>
+          <w:lang w:val="en-US"/>
+        </w:rPr>
+        <w:t>${name}</w:t>
+      </w:r>
+    </w:p>
+    <w:p>
+      <w:pPr>
         <w:bidi/>
         <w:spacing w:after="0"/>
         <w:rPr>
@@ -692,148 +849,277 @@
           <w:bCs w:val="1"/>
           <w:sz w:val="28"/>
           <w:szCs w:val="28"/>
-        </w:rPr>
-        <w:t>organization</w:t>
+          <w:rtl w:val="1"/>
+        </w:rPr>
+        <w:t xml:space="preserve">ويُشار إليها لاحقًا بـ </w:t>
+      </w:r>
+      <w:r>
+        <w:rPr>
+          <w:rFonts w:ascii="Arial" w:hAnsi="Arial" w:eastAsia="Arial" w:cs="Arial"/>
+          <w:b w:val="1"/>
+          <w:bCs w:val="1"/>
+          <w:sz w:val="28"/>
+          <w:szCs w:val="28"/>
+          <w:rtl w:val="1"/>
+        </w:rPr>
+        <w:t>(</w:t>
+      </w:r>
+      <w:r>
+        <w:rPr>
+          <w:rFonts w:ascii="Arial" w:hAnsi="Arial" w:eastAsia="Arial" w:cs="Arial"/>
+          <w:b w:val="1"/>
+          <w:bCs w:val="1"/>
+          <w:sz w:val="28"/>
+          <w:szCs w:val="28"/>
+          <w:rtl w:val="1"/>
+        </w:rPr>
+        <w:t>الطرف الثاني</w:t>
+      </w:r>
+      <w:r>
+        <w:rPr>
+          <w:rFonts w:ascii="Arial" w:hAnsi="Arial" w:eastAsia="Arial" w:cs="Arial"/>
+          <w:b w:val="1"/>
+          <w:bCs w:val="1"/>
+          <w:sz w:val="28"/>
+          <w:szCs w:val="28"/>
+          <w:rtl w:val="1"/>
+        </w:rPr>
+        <w:t>)</w:t>
       </w:r>
     </w:p>
     <w:p>
       <w:pPr>
         <w:bidi/>
-        <w:spacing w:after="0"/>
-        <w:rPr>
-          <w:rFonts w:ascii="Arial" w:hAnsi="Arial" w:eastAsia="Arial" w:cs="Arial"/>
-          <w:b w:val="1"/>
-          <w:bCs w:val="1"/>
-          <w:sz w:val="28"/>
-          <w:szCs w:val="28"/>
-        </w:rPr>
-      </w:pPr>
-      <w:r>
-        <w:rPr>
-          <w:rFonts w:ascii="Arial" w:hAnsi="Arial" w:eastAsia="Arial" w:cs="Arial"/>
-          <w:b w:val="1"/>
-          <w:bCs w:val="1"/>
-          <w:sz w:val="28"/>
-          <w:szCs w:val="28"/>
-          <w:rtl w:val="1"/>
-        </w:rPr>
-        <w:t xml:space="preserve">سجل تجاري رقم: </w:t>
+        <w:rPr>
+          <w:rFonts w:ascii="Arial" w:hAnsi="Arial" w:eastAsia="Arial" w:cs="Arial"/>
+          <w:sz w:val="28"/>
+          <w:szCs w:val="28"/>
+        </w:rPr>
+      </w:pPr>
+      <w:r>
+        <w:rPr>
+          <w:rFonts w:ascii="Arial" w:hAnsi="Arial" w:eastAsia="Arial" w:cs="Arial"/>
+          <w:sz w:val="28"/>
+          <w:szCs w:val="28"/>
+          <w:rtl w:val="1"/>
+        </w:rPr>
+        <w:t xml:space="preserve"> </w:t>
+      </w:r>
+      <w:r>
+        <w:rPr>
+          <w:rFonts w:ascii="Arial" w:hAnsi="Arial" w:eastAsia="Arial" w:cs="Arial"/>
+          <w:sz w:val="28"/>
+          <w:szCs w:val="28"/>
+          <w:rtl w:val="1"/>
+        </w:rPr>
+        <w:t>وقد اتفق الطرفان وهما بكامل أهليتهما الشرعية والنظامية على ما يلي</w:t>
+      </w:r>
+      <w:r>
+        <w:rPr>
+          <w:rFonts w:ascii="Arial" w:hAnsi="Arial" w:eastAsia="Arial" w:cs="Arial"/>
+          <w:sz w:val="28"/>
+          <w:szCs w:val="28"/>
+          <w:rtl w:val="1"/>
+        </w:rPr>
+        <w:t>:</w:t>
       </w:r>
     </w:p>
     <w:p>
       <w:pPr>
+        <w:pStyle w:val="Normal"/>
         <w:bidi/>
-        <w:spacing w:after="0"/>
-        <w:rPr>
-          <w:rFonts w:ascii="Arial" w:hAnsi="Arial" w:eastAsia="Arial" w:cs="Arial"/>
-          <w:b w:val="1"/>
-          <w:bCs w:val="1"/>
-          <w:sz w:val="28"/>
-          <w:szCs w:val="28"/>
-        </w:rPr>
-      </w:pPr>
-      <w:r>
-        <w:rPr>
-          <w:rFonts w:ascii="Arial" w:hAnsi="Arial" w:eastAsia="Arial" w:cs="Arial"/>
-          <w:b w:val="1"/>
-          <w:bCs w:val="1"/>
-          <w:sz w:val="28"/>
-          <w:szCs w:val="28"/>
-        </w:rPr>
-        <w:t>cr_copy</w:t>
+        <w:rPr>
+          <w:rFonts w:ascii="Arial" w:hAnsi="Arial" w:eastAsia="Arial" w:cs="Arial"/>
+          <w:b w:val="1"/>
+          <w:bCs w:val="1"/>
+          <w:sz w:val="28"/>
+          <w:szCs w:val="28"/>
+          <w:rtl w:val="1"/>
+        </w:rPr>
+      </w:pPr>
+      <w:r>
+        <w:rPr>
+          <w:rFonts w:ascii="Arial" w:hAnsi="Arial" w:eastAsia="Arial" w:cs="Arial"/>
+          <w:b w:val="1"/>
+          <w:bCs w:val="1"/>
+          <w:sz w:val="28"/>
+          <w:szCs w:val="28"/>
+          <w:rtl w:val="1"/>
+        </w:rPr>
+        <w:t>المادة (</w:t>
+      </w:r>
+      <w:r>
+        <w:rPr>
+          <w:rFonts w:ascii="Arial" w:hAnsi="Arial" w:eastAsia="Arial" w:cs="Arial"/>
+          <w:b w:val="1"/>
+          <w:bCs w:val="1"/>
+          <w:sz w:val="28"/>
+          <w:szCs w:val="28"/>
+        </w:rPr>
+        <w:t>1</w:t>
+      </w:r>
+      <w:r>
+        <w:rPr>
+          <w:rFonts w:ascii="Arial" w:hAnsi="Arial" w:eastAsia="Arial" w:cs="Arial"/>
+          <w:b w:val="1"/>
+          <w:bCs w:val="1"/>
+          <w:sz w:val="28"/>
+          <w:szCs w:val="28"/>
+          <w:rtl w:val="1"/>
+        </w:rPr>
+        <w:t>): موضوع العقد</w:t>
       </w:r>
     </w:p>
     <w:p>
       <w:pPr>
-        <w:bidi/>
+        <w:pStyle w:val="Normal"/>
+        <w:bidi w:val="0"/>
         <w:spacing w:after="0"/>
-        <w:rPr>
-          <w:rFonts w:ascii="Arial" w:hAnsi="Arial" w:eastAsia="Arial" w:cs="Arial"/>
-          <w:b w:val="1"/>
-          <w:bCs w:val="1"/>
-          <w:sz w:val="28"/>
-          <w:szCs w:val="28"/>
-        </w:rPr>
-      </w:pPr>
-      <w:r>
-        <w:rPr>
-          <w:rFonts w:ascii="Arial" w:hAnsi="Arial" w:eastAsia="Arial" w:cs="Arial"/>
-          <w:b w:val="1"/>
-          <w:bCs w:val="1"/>
-          <w:sz w:val="28"/>
-          <w:szCs w:val="28"/>
-          <w:rtl w:val="1"/>
-        </w:rPr>
-        <w:t xml:space="preserve">اسم مقدم الطلب: </w:t>
+        <w:jc w:val="right"/>
+        <w:rPr>
+          <w:rFonts w:ascii="Arial" w:hAnsi="Arial" w:eastAsia="Arial" w:cs="Arial"/>
+          <w:sz w:val="28"/>
+          <w:szCs w:val="28"/>
+          <w:rtl w:val="1"/>
+        </w:rPr>
+      </w:pPr>
+      <w:r>
+        <w:rPr>
+          <w:rFonts w:ascii="Arial" w:hAnsi="Arial" w:eastAsia="Arial" w:cs="Arial"/>
+          <w:sz w:val="28"/>
+          <w:szCs w:val="28"/>
+          <w:rtl w:val="1"/>
+        </w:rPr>
+        <w:t xml:space="preserve">يقوم </w:t>
+      </w:r>
+      <w:r>
+        <w:rPr>
+          <w:rFonts w:ascii="Arial" w:hAnsi="Arial" w:eastAsia="Arial" w:cs="Arial"/>
+          <w:b w:val="1"/>
+          <w:bCs w:val="1"/>
+          <w:sz w:val="28"/>
+          <w:szCs w:val="28"/>
+          <w:rtl w:val="1"/>
+        </w:rPr>
+        <w:t>الطرف الأول</w:t>
+      </w:r>
+      <w:r>
+        <w:rPr>
+          <w:rFonts w:ascii="Arial" w:hAnsi="Arial" w:eastAsia="Arial" w:cs="Arial"/>
+          <w:sz w:val="28"/>
+          <w:szCs w:val="28"/>
+          <w:rtl w:val="1"/>
+        </w:rPr>
+        <w:t xml:space="preserve"> بتأجير </w:t>
+      </w:r>
+      <w:r>
+        <w:rPr>
+          <w:rFonts w:ascii="Arial" w:hAnsi="Arial" w:eastAsia="Arial" w:cs="Arial"/>
+          <w:b w:val="1"/>
+          <w:bCs w:val="1"/>
+          <w:sz w:val="28"/>
+          <w:szCs w:val="28"/>
+          <w:rtl w:val="1"/>
+        </w:rPr>
+        <w:t>الطرف الثاني</w:t>
+      </w:r>
+      <w:r>
+        <w:rPr>
+          <w:rFonts w:ascii="Arial" w:hAnsi="Arial" w:eastAsia="Arial" w:cs="Arial"/>
+          <w:sz w:val="28"/>
+          <w:szCs w:val="28"/>
+          <w:rtl w:val="1"/>
+        </w:rPr>
+        <w:t xml:space="preserve"> مساحة عرض </w:t>
+      </w:r>
+      <w:r>
+        <w:rPr>
+          <w:rFonts w:ascii="Arial" w:hAnsi="Arial" w:eastAsia="Arial" w:cs="Arial"/>
+          <w:sz w:val="28"/>
+          <w:szCs w:val="28"/>
+          <w:rtl w:val="1"/>
+        </w:rPr>
+        <w:t>رقم</w:t>
+      </w:r>
+      <w:r>
+        <w:rPr>
+          <w:rFonts w:ascii="Arial" w:hAnsi="Arial" w:eastAsia="Arial" w:cs="Arial"/>
+          <w:sz w:val="28"/>
+          <w:szCs w:val="28"/>
+        </w:rPr>
+        <w:t xml:space="preserve"> </w:t>
       </w:r>
     </w:p>
     <w:p>
       <w:pPr>
-        <w:bidi/>
+        <w:pStyle w:val="Normal"/>
+        <w:bidi w:val="0"/>
         <w:spacing w:after="0"/>
-        <w:rPr>
-          <w:rFonts w:ascii="Arial" w:hAnsi="Arial" w:eastAsia="Arial" w:cs="Arial"/>
-          <w:b w:val="1"/>
-          <w:bCs w:val="1"/>
-          <w:sz w:val="28"/>
-          <w:szCs w:val="28"/>
-          <w:rtl w:val="1"/>
-        </w:rPr>
-      </w:pPr>
-      <w:r>
-        <w:rPr>
-          <w:rFonts w:ascii="Arial" w:hAnsi="Arial" w:eastAsia="Arial" w:cs="Arial"/>
-          <w:b w:val="1"/>
-          <w:bCs w:val="1"/>
-          <w:sz w:val="28"/>
-          <w:szCs w:val="28"/>
-        </w:rPr>
-        <w:t>name</w:t>
+        <w:jc w:val="center"/>
+        <w:rPr>
+          <w:rFonts w:ascii="Arial" w:hAnsi="Arial" w:eastAsia="Arial" w:cs="Arial"/>
+          <w:noProof w:val="0"/>
+          <w:sz w:val="28"/>
+          <w:szCs w:val="28"/>
+          <w:lang w:val="en-US"/>
+        </w:rPr>
+      </w:pPr>
+      <w:r>
+        <w:rPr>
+          <w:rFonts w:ascii="Arial" w:hAnsi="Arial" w:eastAsia="Arial" w:cs="Arial"/>
+          <w:noProof w:val="0"/>
+          <w:sz w:val="28"/>
+          <w:szCs w:val="28"/>
+          <w:lang w:val="en-US"/>
+        </w:rPr>
+        <w:t>${hall}</w:t>
       </w:r>
     </w:p>
     <w:p>
       <w:pPr>
         <w:bidi/>
-        <w:spacing w:after="0"/>
-        <w:rPr>
-          <w:rFonts w:ascii="Arial" w:hAnsi="Arial" w:eastAsia="Arial" w:cs="Arial"/>
-          <w:sz w:val="28"/>
-          <w:szCs w:val="28"/>
-          <w:rtl w:val="1"/>
-        </w:rPr>
-      </w:pPr>
-      <w:r>
-        <w:rPr>
-          <w:sz w:val="28"/>
-          <w:szCs w:val="28"/>
-          <w:rtl/>
-        </w:rPr>
-        <w:tab/>
-      </w:r>
-    </w:p>
-    <w:p>
-      <w:pPr>
-        <w:bidi/>
-        <w:spacing w:after="0"/>
-        <w:rPr>
-          <w:rFonts w:ascii="Arial" w:hAnsi="Arial" w:eastAsia="Arial" w:cs="Arial"/>
-          <w:b w:val="1"/>
-          <w:bCs w:val="1"/>
-          <w:sz w:val="28"/>
-          <w:szCs w:val="28"/>
-          <w:rtl w:val="1"/>
-        </w:rPr>
-      </w:pPr>
-      <w:r>
-        <w:rPr>
-          <w:rFonts w:ascii="Arial" w:hAnsi="Arial" w:eastAsia="Arial" w:cs="Arial"/>
-          <w:b w:val="1"/>
-          <w:bCs w:val="1"/>
-          <w:sz w:val="28"/>
-          <w:szCs w:val="28"/>
-          <w:rtl w:val="1"/>
-        </w:rPr>
-        <w:t xml:space="preserve">ويُشار إليها لاحقًا بـ </w:t>
+        <w:rPr>
+          <w:rFonts w:ascii="Arial" w:hAnsi="Arial" w:eastAsia="Arial" w:cs="Arial"/>
+          <w:sz w:val="28"/>
+          <w:szCs w:val="28"/>
+          <w:rtl w:val="1"/>
+        </w:rPr>
+      </w:pPr>
+      <w:r>
+        <w:rPr>
+          <w:rFonts w:ascii="Arial" w:hAnsi="Arial" w:eastAsia="Arial" w:cs="Arial"/>
+          <w:sz w:val="28"/>
+          <w:szCs w:val="28"/>
+          <w:rtl w:val="1"/>
+        </w:rPr>
+        <w:t xml:space="preserve">وذلك </w:t>
+      </w:r>
+      <w:r>
+        <w:rPr>
+          <w:rFonts w:ascii="Arial" w:hAnsi="Arial" w:eastAsia="Arial" w:cs="Arial"/>
+          <w:sz w:val="28"/>
+          <w:szCs w:val="28"/>
+          <w:rtl w:val="1"/>
+        </w:rPr>
+        <w:t xml:space="preserve">داخل المعرض </w:t>
+      </w:r>
+      <w:r>
+        <w:rPr>
+          <w:rFonts w:ascii="Arial" w:hAnsi="Arial" w:eastAsia="Arial" w:cs="Arial"/>
+          <w:sz w:val="28"/>
+          <w:szCs w:val="28"/>
+          <w:rtl w:val="1"/>
+        </w:rPr>
+        <w:t xml:space="preserve">المذكور أعلاه </w:t>
+      </w:r>
+      <w:r>
+        <w:rPr>
+          <w:rFonts w:ascii="Arial" w:hAnsi="Arial" w:eastAsia="Arial" w:cs="Arial"/>
+          <w:sz w:val="28"/>
+          <w:szCs w:val="28"/>
+          <w:rtl w:val="1"/>
+        </w:rPr>
+        <w:t xml:space="preserve">وفق المخطط المعتمد، بمساحة </w:t>
       </w:r>
       <w:r>
         <w:rPr>
@@ -853,45 +1139,46 @@
           <w:bCs w:val="1"/>
           <w:sz w:val="28"/>
           <w:szCs w:val="28"/>
-          <w:rtl w:val="1"/>
-        </w:rPr>
-        <w:t>الطرف الثاني</w:t>
-      </w:r>
-      <w:r>
-        <w:rPr>
-          <w:rFonts w:ascii="Arial" w:hAnsi="Arial" w:eastAsia="Arial" w:cs="Arial"/>
-          <w:b w:val="1"/>
-          <w:bCs w:val="1"/>
-          <w:sz w:val="28"/>
-          <w:szCs w:val="28"/>
-          <w:rtl w:val="1"/>
-        </w:rPr>
-        <w:t>)</w:t>
-      </w:r>
-    </w:p>
-    <w:p>
-      <w:pPr>
-        <w:bidi/>
-        <w:rPr>
-          <w:rFonts w:ascii="Arial" w:hAnsi="Arial" w:eastAsia="Arial" w:cs="Arial"/>
-          <w:sz w:val="28"/>
-          <w:szCs w:val="28"/>
-          <w:rtl w:val="1"/>
-        </w:rPr>
-      </w:pPr>
-    </w:p>
-    <w:p>
-      <w:pPr>
-        <w:bidi/>
-        <w:rPr>
-          <w:rFonts w:ascii="Arial" w:hAnsi="Arial" w:eastAsia="Arial" w:cs="Arial"/>
-          <w:sz w:val="28"/>
-          <w:szCs w:val="28"/>
-        </w:rPr>
-      </w:pPr>
-      <w:r>
-        <w:rPr>
-          <w:rFonts w:ascii="Arial" w:hAnsi="Arial" w:eastAsia="Arial" w:cs="Arial"/>
+        </w:rPr>
+        <w:t>3</w:t>
+      </w:r>
+      <w:r>
+        <w:rPr>
+          <w:rFonts w:ascii="Arial" w:hAnsi="Arial" w:eastAsia="Arial" w:cs="Arial"/>
+          <w:b w:val="1"/>
+          <w:bCs w:val="1"/>
+          <w:sz w:val="28"/>
+          <w:szCs w:val="28"/>
+          <w:rtl w:val="1"/>
+        </w:rPr>
+        <w:t xml:space="preserve"> × </w:t>
+      </w:r>
+      <w:r>
+        <w:rPr>
+          <w:rFonts w:ascii="Arial" w:hAnsi="Arial" w:eastAsia="Arial" w:cs="Arial"/>
+          <w:b w:val="1"/>
+          <w:bCs w:val="1"/>
+          <w:sz w:val="28"/>
+          <w:szCs w:val="28"/>
+        </w:rPr>
+        <w:t>2</w:t>
+      </w:r>
+      <w:r>
+        <w:rPr>
+          <w:rFonts w:ascii="Arial" w:hAnsi="Arial" w:eastAsia="Arial" w:cs="Arial"/>
+          <w:b w:val="1"/>
+          <w:bCs w:val="1"/>
+          <w:sz w:val="28"/>
+          <w:szCs w:val="28"/>
+          <w:rtl w:val="1"/>
+        </w:rPr>
+        <w:t xml:space="preserve">) </w:t>
+      </w:r>
+      <w:r>
+        <w:rPr>
+          <w:rFonts w:ascii="Arial" w:hAnsi="Arial" w:eastAsia="Arial" w:cs="Arial"/>
+          <w:b w:val="1"/>
+          <w:bCs w:val="1"/>
           <w:sz w:val="28"/>
           <w:szCs w:val="28"/>
           <w:rtl w:val="1"/>
@@ -901,173 +1188,41 @@
       <w:r>
         <w:rPr>
           <w:rFonts w:ascii="Arial" w:hAnsi="Arial" w:eastAsia="Arial" w:cs="Arial"/>
-          <w:sz w:val="28"/>
-          <w:szCs w:val="28"/>
-          <w:rtl w:val="1"/>
-        </w:rPr>
-        <w:t>وقد اتفق الطرفان وهما بكامل أهليتهما الشرعية والنظامية على ما يلي</w:t>
-      </w:r>
-      <w:r>
-        <w:rPr>
-          <w:rFonts w:ascii="Arial" w:hAnsi="Arial" w:eastAsia="Arial" w:cs="Arial"/>
-          <w:sz w:val="28"/>
-          <w:szCs w:val="28"/>
-          <w:rtl w:val="1"/>
-        </w:rPr>
-        <w:t>:</w:t>
-      </w:r>
-    </w:p>
-    <w:p>
-      <w:pPr>
-        <w:pStyle w:val="Normal"/>
-        <w:bidi/>
-        <w:rPr>
-          <w:rFonts w:ascii="Arial" w:hAnsi="Arial" w:eastAsia="Arial" w:cs="Arial"/>
-          <w:b w:val="1"/>
-          <w:bCs w:val="1"/>
-          <w:sz w:val="28"/>
-          <w:szCs w:val="28"/>
-          <w:rtl w:val="1"/>
-        </w:rPr>
-      </w:pPr>
-      <w:r>
-        <w:rPr>
-          <w:rFonts w:ascii="Arial" w:hAnsi="Arial" w:eastAsia="Arial" w:cs="Arial"/>
-          <w:b w:val="1"/>
-          <w:bCs w:val="1"/>
-          <w:sz w:val="28"/>
-          <w:szCs w:val="28"/>
-          <w:rtl w:val="1"/>
-        </w:rPr>
-        <w:t>المادة (</w:t>
-      </w:r>
-      <w:r>
-        <w:rPr>
-          <w:rFonts w:ascii="Arial" w:hAnsi="Arial" w:eastAsia="Arial" w:cs="Arial"/>
-          <w:b w:val="1"/>
-          <w:bCs w:val="1"/>
-          <w:sz w:val="28"/>
-          <w:szCs w:val="28"/>
-        </w:rPr>
-        <w:t>1</w:t>
-      </w:r>
-      <w:r>
-        <w:rPr>
-          <w:rFonts w:ascii="Arial" w:hAnsi="Arial" w:eastAsia="Arial" w:cs="Arial"/>
-          <w:b w:val="1"/>
-          <w:bCs w:val="1"/>
-          <w:sz w:val="28"/>
-          <w:szCs w:val="28"/>
-          <w:rtl w:val="1"/>
-        </w:rPr>
-        <w:t>): موضوع العقد</w:t>
-      </w:r>
-    </w:p>
-    <w:p>
-      <w:pPr>
-        <w:pStyle w:val="Normal"/>
-        <w:bidi/>
-        <w:spacing w:after="0"/>
-        <w:rPr>
-          <w:rFonts w:ascii="Arial" w:hAnsi="Arial" w:eastAsia="Arial" w:cs="Arial"/>
-          <w:sz w:val="28"/>
-          <w:szCs w:val="28"/>
-        </w:rPr>
-      </w:pPr>
-      <w:r>
-        <w:rPr>
-          <w:rFonts w:ascii="Arial" w:hAnsi="Arial" w:eastAsia="Arial" w:cs="Arial"/>
-          <w:sz w:val="28"/>
-          <w:szCs w:val="28"/>
-          <w:rtl w:val="1"/>
-        </w:rPr>
-        <w:t xml:space="preserve">يقوم </w:t>
-      </w:r>
-      <w:r>
-        <w:rPr>
-          <w:rFonts w:ascii="Arial" w:hAnsi="Arial" w:eastAsia="Arial" w:cs="Arial"/>
-          <w:b w:val="1"/>
-          <w:bCs w:val="1"/>
-          <w:sz w:val="28"/>
-          <w:szCs w:val="28"/>
-          <w:rtl w:val="1"/>
-        </w:rPr>
-        <w:t>الطرف الأول</w:t>
-      </w:r>
-      <w:r>
-        <w:rPr>
-          <w:rFonts w:ascii="Arial" w:hAnsi="Arial" w:eastAsia="Arial" w:cs="Arial"/>
-          <w:sz w:val="28"/>
-          <w:szCs w:val="28"/>
-          <w:rtl w:val="1"/>
-        </w:rPr>
-        <w:t xml:space="preserve"> بتأجير </w:t>
-      </w:r>
-      <w:r>
-        <w:rPr>
-          <w:rFonts w:ascii="Arial" w:hAnsi="Arial" w:eastAsia="Arial" w:cs="Arial"/>
-          <w:b w:val="1"/>
-          <w:bCs w:val="1"/>
-          <w:sz w:val="28"/>
-          <w:szCs w:val="28"/>
-          <w:rtl w:val="1"/>
-        </w:rPr>
-        <w:t>الطرف الثاني</w:t>
-      </w:r>
-      <w:r>
-        <w:rPr>
-          <w:rFonts w:ascii="Arial" w:hAnsi="Arial" w:eastAsia="Arial" w:cs="Arial"/>
-          <w:sz w:val="28"/>
-          <w:szCs w:val="28"/>
-          <w:rtl w:val="1"/>
-        </w:rPr>
-        <w:t xml:space="preserve"> مساحة عرض </w:t>
-      </w:r>
-      <w:r>
-        <w:rPr>
-          <w:rFonts w:ascii="Arial" w:hAnsi="Arial" w:eastAsia="Arial" w:cs="Arial"/>
-          <w:sz w:val="28"/>
-          <w:szCs w:val="28"/>
-          <w:rtl w:val="1"/>
-        </w:rPr>
-        <w:t>رقم</w:t>
-      </w:r>
-      <w:r>
-        <w:rPr>
-          <w:rFonts w:ascii="Arial" w:hAnsi="Arial" w:eastAsia="Arial" w:cs="Arial"/>
-          <w:sz w:val="28"/>
-          <w:szCs w:val="28"/>
-          <w:rtl w:val="1"/>
-        </w:rPr>
-        <w:t xml:space="preserve"> </w:t>
-      </w:r>
-      <w:r>
-        <w:rPr>
-          <w:rFonts w:ascii="Arial" w:hAnsi="Arial" w:eastAsia="Arial" w:cs="Arial"/>
-          <w:sz w:val="28"/>
-          <w:szCs w:val="28"/>
-        </w:rPr>
-        <w:t xml:space="preserve">hall  </w:t>
-      </w:r>
-    </w:p>
-    <w:p>
-      <w:pPr>
-        <w:bidi/>
-        <w:rPr>
-          <w:rFonts w:ascii="Arial" w:hAnsi="Arial" w:eastAsia="Arial" w:cs="Arial"/>
-          <w:sz w:val="28"/>
-          <w:szCs w:val="28"/>
-        </w:rPr>
-      </w:pPr>
+          <w:b w:val="1"/>
+          <w:bCs w:val="1"/>
+          <w:sz w:val="28"/>
+          <w:szCs w:val="28"/>
+          <w:rtl w:val="1"/>
+        </w:rPr>
+        <w:t>متر</w:t>
+      </w:r>
+      <w:r>
+        <w:rPr>
+          <w:rFonts w:ascii="Arial" w:hAnsi="Arial" w:eastAsia="Arial" w:cs="Arial"/>
+          <w:sz w:val="28"/>
+          <w:szCs w:val="28"/>
+          <w:rtl w:val="1"/>
+        </w:rPr>
+        <w:t>، وذلك خلال فترة إقامة المعرض، إضافة إلى أيام التركيب والفك التي يحددها الطرف الأول</w:t>
+      </w:r>
+      <w:r>
+        <w:rPr>
+          <w:rFonts w:ascii="Arial" w:hAnsi="Arial" w:eastAsia="Arial" w:cs="Arial"/>
+          <w:sz w:val="28"/>
+          <w:szCs w:val="28"/>
+          <w:rtl w:val="1"/>
+        </w:rPr>
+        <w:t>.</w:t>
+      </w:r>
       <w:r>
         <w:drawing>
-          <wp:anchor distT="0" distB="0" distL="114300" distR="114300" simplePos="0" relativeHeight="251658240" behindDoc="0" locked="0" layoutInCell="1" allowOverlap="1" wp14:editId="40CC9E11" wp14:anchorId="767B3373">
+          <wp:anchor distT="0" distB="0" distL="114300" distR="114300" simplePos="0" relativeHeight="251658240" behindDoc="0" locked="0" layoutInCell="1" allowOverlap="1" wp14:editId="1E4E90D3" wp14:anchorId="767B3373">
             <wp:simplePos x="0" y="0"/>
             <wp:positionH relativeFrom="column">
-              <wp:posOffset>0</wp:posOffset>
+              <wp:posOffset>76200</wp:posOffset>
             </wp:positionH>
             <wp:positionV relativeFrom="paragraph">
-              <wp:posOffset>381000</wp:posOffset>
+              <wp:posOffset>476250</wp:posOffset>
             </wp:positionV>
             <wp:extent cx="1613826" cy="731787"/>
             <wp:effectExtent l="0" t="0" r="0" b="5080"/>
@@ -1123,143 +1278,30 @@
           </wp:anchor>
         </w:drawing>
       </w:r>
-      <w:r>
-        <w:rPr>
-          <w:rFonts w:ascii="Arial" w:hAnsi="Arial" w:eastAsia="Arial" w:cs="Arial"/>
-          <w:sz w:val="28"/>
-          <w:szCs w:val="28"/>
-          <w:rtl w:val="1"/>
-        </w:rPr>
-        <w:t xml:space="preserve">وذلك </w:t>
-      </w:r>
-      <w:r>
-        <w:rPr>
-          <w:rFonts w:ascii="Arial" w:hAnsi="Arial" w:eastAsia="Arial" w:cs="Arial"/>
-          <w:sz w:val="28"/>
-          <w:szCs w:val="28"/>
-          <w:rtl w:val="1"/>
-        </w:rPr>
-        <w:t xml:space="preserve">داخل المعرض </w:t>
-      </w:r>
-      <w:r>
-        <w:rPr>
-          <w:rFonts w:ascii="Arial" w:hAnsi="Arial" w:eastAsia="Arial" w:cs="Arial"/>
-          <w:sz w:val="28"/>
-          <w:szCs w:val="28"/>
-          <w:rtl w:val="1"/>
-        </w:rPr>
-        <w:t xml:space="preserve">المذكور أعلاه </w:t>
-      </w:r>
-      <w:r>
-        <w:rPr>
-          <w:rFonts w:ascii="Arial" w:hAnsi="Arial" w:eastAsia="Arial" w:cs="Arial"/>
-          <w:sz w:val="28"/>
-          <w:szCs w:val="28"/>
-          <w:rtl w:val="1"/>
-        </w:rPr>
-        <w:t xml:space="preserve">وفق المخطط المعتمد، بمساحة </w:t>
-      </w:r>
-      <w:r>
-        <w:rPr>
-          <w:rFonts w:ascii="Arial" w:hAnsi="Arial" w:eastAsia="Arial" w:cs="Arial"/>
-          <w:b w:val="1"/>
-          <w:bCs w:val="1"/>
-          <w:sz w:val="28"/>
-          <w:szCs w:val="28"/>
-          <w:rtl w:val="1"/>
-        </w:rPr>
-        <w:t>(</w:t>
-      </w:r>
-      <w:r>
-        <w:rPr>
-          <w:rFonts w:ascii="Arial" w:hAnsi="Arial" w:eastAsia="Arial" w:cs="Arial"/>
-          <w:b w:val="1"/>
-          <w:bCs w:val="1"/>
-          <w:sz w:val="28"/>
-          <w:szCs w:val="28"/>
-        </w:rPr>
-        <w:t>3</w:t>
-      </w:r>
-      <w:r>
-        <w:rPr>
-          <w:rFonts w:ascii="Arial" w:hAnsi="Arial" w:eastAsia="Arial" w:cs="Arial"/>
-          <w:b w:val="1"/>
-          <w:bCs w:val="1"/>
-          <w:sz w:val="28"/>
-          <w:szCs w:val="28"/>
-          <w:rtl w:val="1"/>
-        </w:rPr>
-        <w:t xml:space="preserve"> × </w:t>
-      </w:r>
-      <w:r>
-        <w:rPr>
-          <w:rFonts w:ascii="Arial" w:hAnsi="Arial" w:eastAsia="Arial" w:cs="Arial"/>
-          <w:b w:val="1"/>
-          <w:bCs w:val="1"/>
-          <w:sz w:val="28"/>
-          <w:szCs w:val="28"/>
-        </w:rPr>
-        <w:t>2</w:t>
-      </w:r>
-      <w:r>
-        <w:rPr>
-          <w:rFonts w:ascii="Arial" w:hAnsi="Arial" w:eastAsia="Arial" w:cs="Arial"/>
-          <w:b w:val="1"/>
-          <w:bCs w:val="1"/>
-          <w:sz w:val="28"/>
-          <w:szCs w:val="28"/>
-          <w:rtl w:val="1"/>
-        </w:rPr>
-        <w:t xml:space="preserve">) </w:t>
-      </w:r>
-      <w:r>
-        <w:rPr>
-          <w:rFonts w:ascii="Arial" w:hAnsi="Arial" w:eastAsia="Arial" w:cs="Arial"/>
-          <w:b w:val="1"/>
-          <w:bCs w:val="1"/>
-          <w:sz w:val="28"/>
-          <w:szCs w:val="28"/>
-          <w:rtl w:val="1"/>
-        </w:rPr>
-        <w:t xml:space="preserve"> </w:t>
-      </w:r>
-      <w:r>
-        <w:rPr>
-          <w:rFonts w:ascii="Arial" w:hAnsi="Arial" w:eastAsia="Arial" w:cs="Arial"/>
-          <w:b w:val="1"/>
-          <w:bCs w:val="1"/>
-          <w:sz w:val="28"/>
-          <w:szCs w:val="28"/>
-          <w:rtl w:val="1"/>
-        </w:rPr>
-        <w:t>متر</w:t>
-      </w:r>
-      <w:r>
-        <w:rPr>
-          <w:rFonts w:ascii="Arial" w:hAnsi="Arial" w:eastAsia="Arial" w:cs="Arial"/>
-          <w:sz w:val="28"/>
-          <w:szCs w:val="28"/>
-          <w:rtl w:val="1"/>
-        </w:rPr>
-        <w:t>، وذلك خلال فترة إقامة المعرض، إضافة إلى أيام التركيب والفك التي يحددها الطرف الأول</w:t>
-      </w:r>
-      <w:r>
-        <w:rPr>
-          <w:rFonts w:ascii="Arial" w:hAnsi="Arial" w:eastAsia="Arial" w:cs="Arial"/>
-          <w:sz w:val="28"/>
-          <w:szCs w:val="28"/>
-          <w:rtl w:val="1"/>
-        </w:rPr>
-        <w:t>.</w:t>
-      </w:r>
     </w:p>
     <w:p>
       <w:pPr>
-        <w:bidi/>
-        <w:rPr>
-          <w:rFonts w:ascii="Arial" w:hAnsi="Arial" w:eastAsia="Arial" w:cs="Arial"/>
-          <w:sz w:val="28"/>
-          <w:szCs w:val="28"/>
+        <w:bidi w:val="1"/>
+        <w:rPr>
+          <w:rFonts w:ascii="Arial" w:hAnsi="Arial" w:eastAsia="Arial" w:cs="Arial"/>
+        </w:rPr>
+      </w:pPr>
+      <w:r>
+        <w:rPr>
+          <w:rFonts w:ascii="Arial" w:hAnsi="Arial" w:eastAsia="Arial" w:cs="Arial"/>
+        </w:rPr>
+        <w:br w:type="page"/>
+      </w:r>
+    </w:p>
+    <w:p>
+      <w:pPr>
+        <w:pStyle w:val="Normal"/>
+        <w:bidi w:val="1"/>
+        <w:rPr>
+          <w:rFonts w:ascii="Arial" w:hAnsi="Arial" w:eastAsia="Arial" w:cs="Arial"/>
+          <w:sz w:val="28"/>
+          <w:szCs w:val="28"/>
+          <w:rtl w:val="1"/>
         </w:rPr>
       </w:pPr>
     </w:p>
@@ -1304,7 +1346,7 @@
             </w:pPr>
             <w:r>
               <w:drawing>
-                <wp:inline wp14:editId="0E0A1FED" wp14:anchorId="70745379">
+                <wp:inline wp14:editId="4923392B" wp14:anchorId="70745379">
                   <wp:extent cx="2062595" cy="803564"/>
                   <wp:effectExtent l="0" t="0" r="0" b="0"/>
                   <wp:docPr id="1268605462" name="Picture 1" descr="A logo with purple letters and numbers&#10;&#10;AI-generated content may be incorrect."/>
@@ -1387,7 +1429,7 @@
             </w:pPr>
             <w:r>
               <w:drawing>
-                <wp:inline wp14:editId="0383FE30" wp14:anchorId="7E8A97B5">
+                <wp:inline wp14:editId="02C574F4" wp14:anchorId="7E8A97B5">
                   <wp:extent cx="1432560" cy="381000"/>
                   <wp:effectExtent l="0" t="0" r="0" b="0"/>
                   <wp:docPr id="1772269162" name="Picture 734064909" descr="Background pattern&#10;&#10;Description automatically generated with low confidence"/>
@@ -1453,7 +1495,7 @@
             </w:pPr>
             <w:r>
               <w:drawing>
-                <wp:inline wp14:editId="2D8E5345" wp14:anchorId="7DB69F20">
+                <wp:inline wp14:editId="03094077" wp14:anchorId="7DB69F20">
                   <wp:extent cx="1905000" cy="732155"/>
                   <wp:effectExtent l="0" t="0" r="0" b="0"/>
                   <wp:docPr id="807100138" name="Picture 1157273046" descr="Background pattern&#10;&#10;Description automatically generated with low confidence"/>
@@ -2422,7 +2464,7 @@
         </w:rPr>
         <w:t>يلتزم الطرف الثاني بتزويد الطرف الأول بصورة من الحوالة البنكية عبر البريد الإلكتروني (</w:t>
       </w:r>
-      <w:hyperlink r:id="Re785e7a45f44410c">
+      <w:hyperlink r:id="R7a565d83aa064196">
         <w:r>
           <w:rPr>
             <w:rStyle w:val="Hyperlink"/>
@@ -2642,43 +2684,14 @@
         </w:rPr>
       </w:pPr>
       <w:r>
-        <w:rPr>
-          <w:rFonts w:ascii="Arial" w:hAnsi="Arial" w:eastAsia="Arial" w:cs="Arial"/>
-          <w:sz w:val="28"/>
-          <w:szCs w:val="28"/>
-          <w:rtl w:val="1"/>
-        </w:rPr>
-        <w:t xml:space="preserve">عدم التنازل عن المساحة أو تأجيرها من الباطن أو مشاركتها مع أي طرف آخر إلا بعد الحصول على موافقة خطية مسبقة من </w:t>
-      </w:r>
-      <w:r>
-        <w:rPr>
-          <w:rFonts w:ascii="Arial" w:hAnsi="Arial" w:eastAsia="Arial" w:cs="Arial"/>
-          <w:b w:val="1"/>
-          <w:bCs w:val="1"/>
-          <w:sz w:val="28"/>
-          <w:szCs w:val="28"/>
-          <w:rtl w:val="1"/>
-        </w:rPr>
-        <w:t>الطرف الأول</w:t>
-      </w:r>
-      <w:r>
-        <w:rPr>
-          <w:rFonts w:ascii="Arial" w:hAnsi="Arial" w:eastAsia="Arial" w:cs="Arial"/>
-          <w:sz w:val="28"/>
-          <w:szCs w:val="28"/>
-          <w:rtl w:val="1"/>
-        </w:rPr>
-        <w:t>.</w:t>
-      </w:r>
-      <w:r>
         <w:drawing>
-          <wp:anchor distT="0" distB="0" distL="114300" distR="114300" simplePos="0" relativeHeight="251658240" behindDoc="0" locked="0" layoutInCell="1" allowOverlap="1" wp14:editId="5124CC0A" wp14:anchorId="7A1B4ACD">
+          <wp:anchor distT="0" distB="0" distL="114300" distR="114300" simplePos="0" relativeHeight="251658240" behindDoc="0" locked="0" layoutInCell="1" allowOverlap="1" wp14:editId="796718BC" wp14:anchorId="7A1B4ACD">
             <wp:simplePos x="0" y="0"/>
             <wp:positionH relativeFrom="column">
-              <wp:posOffset>-19050</wp:posOffset>
+              <wp:posOffset>123825</wp:posOffset>
             </wp:positionH>
             <wp:positionV relativeFrom="paragraph">
-              <wp:posOffset>476250</wp:posOffset>
+              <wp:posOffset>457200</wp:posOffset>
             </wp:positionV>
             <wp:extent cx="1613826" cy="731787"/>
             <wp:effectExtent l="0" t="0" r="0" b="5080"/>
@@ -2734,6 +2747,62 @@
           </wp:anchor>
         </w:drawing>
       </w:r>
+      <w:r>
+        <w:rPr>
+          <w:rFonts w:ascii="Arial" w:hAnsi="Arial" w:eastAsia="Arial" w:cs="Arial"/>
+          <w:sz w:val="28"/>
+          <w:szCs w:val="28"/>
+          <w:rtl w:val="1"/>
+        </w:rPr>
+        <w:t xml:space="preserve">عدم التنازل عن المساحة أو تأجيرها من الباطن أو مشاركتها مع أي طرف آخر إلا بعد الحصول على موافقة خطية مسبقة من </w:t>
+      </w:r>
+      <w:r>
+        <w:rPr>
+          <w:rFonts w:ascii="Arial" w:hAnsi="Arial" w:eastAsia="Arial" w:cs="Arial"/>
+          <w:b w:val="1"/>
+          <w:bCs w:val="1"/>
+          <w:sz w:val="28"/>
+          <w:szCs w:val="28"/>
+          <w:rtl w:val="1"/>
+        </w:rPr>
+        <w:t>الطرف الأول</w:t>
+      </w:r>
+      <w:r>
+        <w:rPr>
+          <w:rFonts w:ascii="Arial" w:hAnsi="Arial" w:eastAsia="Arial" w:cs="Arial"/>
+          <w:sz w:val="28"/>
+          <w:szCs w:val="28"/>
+          <w:rtl w:val="1"/>
+        </w:rPr>
+        <w:t>.</w:t>
+      </w:r>
+    </w:p>
+    <w:p>
+      <w:pPr>
+        <w:bidi w:val="1"/>
+        <w:rPr>
+          <w:rFonts w:ascii="Arial" w:hAnsi="Arial" w:eastAsia="Arial" w:cs="Arial"/>
+        </w:rPr>
+      </w:pPr>
+      <w:r>
+        <w:rPr>
+          <w:rFonts w:ascii="Arial" w:hAnsi="Arial" w:eastAsia="Arial" w:cs="Arial"/>
+        </w:rPr>
+        <w:br w:type="page"/>
+      </w:r>
+    </w:p>
+    <w:p>
+      <w:pPr>
+        <w:pStyle w:val="Normal"/>
+        <w:bidi w:val="1"/>
+        <w:ind w:left="720"/>
+        <w:rPr>
+          <w:rFonts w:ascii="Arial" w:hAnsi="Arial" w:eastAsia="Arial" w:cs="Arial"/>
+          <w:sz w:val="28"/>
+          <w:szCs w:val="28"/>
+          <w:rtl w:val="1"/>
+        </w:rPr>
+      </w:pPr>
     </w:p>
     <w:tbl>
       <w:tblPr>
@@ -2776,7 +2845,7 @@
             </w:pPr>
             <w:r>
               <w:drawing>
-                <wp:inline wp14:editId="1DFA3893" wp14:anchorId="2B870441">
+                <wp:inline wp14:editId="5DC11671" wp14:anchorId="2B870441">
                   <wp:extent cx="2062595" cy="803564"/>
                   <wp:effectExtent l="0" t="0" r="0" b="0"/>
                   <wp:docPr id="1263759944" name="Picture 1" descr="A logo with purple letters and numbers&#10;&#10;AI-generated content may be incorrect."/>
@@ -2859,7 +2928,7 @@
             </w:pPr>
             <w:r>
               <w:drawing>
-                <wp:inline wp14:editId="4A8C4F9D" wp14:anchorId="5F9469B1">
+                <wp:inline wp14:editId="07E50922" wp14:anchorId="5F9469B1">
                   <wp:extent cx="1432560" cy="381000"/>
                   <wp:effectExtent l="0" t="0" r="0" b="0"/>
                   <wp:docPr id="1137802053" name="Picture 734064909" descr="Background pattern&#10;&#10;Description automatically generated with low confidence"/>
@@ -2925,7 +2994,7 @@
             </w:pPr>
             <w:r>
               <w:drawing>
-                <wp:inline wp14:editId="2BDEE967" wp14:anchorId="05396F47">
+                <wp:inline wp14:editId="5DEEC676" wp14:anchorId="05396F47">
                   <wp:extent cx="1905000" cy="732155"/>
                   <wp:effectExtent l="0" t="0" r="0" b="0"/>
                   <wp:docPr id="1125603714" name="Picture 1157273046" descr="Background pattern&#10;&#10;Description automatically generated with low confidence"/>
@@ -3748,126 +3817,14 @@
         </w:rPr>
       </w:pPr>
       <w:r>
-        <w:rPr>
-          <w:rFonts w:ascii="Arial" w:hAnsi="Arial" w:eastAsia="Arial" w:cs="Arial"/>
-          <w:sz w:val="28"/>
-          <w:szCs w:val="28"/>
-          <w:rtl w:val="1"/>
-        </w:rPr>
-        <w:t xml:space="preserve">يلتزم </w:t>
-      </w:r>
-      <w:r>
-        <w:rPr>
-          <w:rFonts w:ascii="Arial" w:hAnsi="Arial" w:eastAsia="Arial" w:cs="Arial"/>
-          <w:b w:val="1"/>
-          <w:bCs w:val="1"/>
-          <w:sz w:val="28"/>
-          <w:szCs w:val="28"/>
-          <w:rtl w:val="1"/>
-        </w:rPr>
-        <w:t>الطرف الثاني</w:t>
-      </w:r>
-      <w:r>
-        <w:rPr>
-          <w:rFonts w:ascii="Arial" w:hAnsi="Arial" w:eastAsia="Arial" w:cs="Arial"/>
-          <w:sz w:val="28"/>
-          <w:szCs w:val="28"/>
-          <w:rtl w:val="1"/>
-        </w:rPr>
-        <w:t xml:space="preserve"> بتعويض </w:t>
-      </w:r>
-      <w:r>
-        <w:rPr>
-          <w:rFonts w:ascii="Arial" w:hAnsi="Arial" w:eastAsia="Arial" w:cs="Arial"/>
-          <w:b w:val="1"/>
-          <w:bCs w:val="1"/>
-          <w:sz w:val="28"/>
-          <w:szCs w:val="28"/>
-          <w:rtl w:val="1"/>
-        </w:rPr>
-        <w:t>الطرف الأول</w:t>
-      </w:r>
-      <w:r>
-        <w:rPr>
-          <w:rFonts w:ascii="Arial" w:hAnsi="Arial" w:eastAsia="Arial" w:cs="Arial"/>
-          <w:sz w:val="28"/>
-          <w:szCs w:val="28"/>
-          <w:rtl w:val="1"/>
-        </w:rPr>
-        <w:t xml:space="preserve"> عن أي </w:t>
-      </w:r>
-      <w:r>
-        <w:rPr>
-          <w:rFonts w:ascii="Arial" w:hAnsi="Arial" w:eastAsia="Arial" w:cs="Arial"/>
-          <w:sz w:val="28"/>
-          <w:szCs w:val="28"/>
-          <w:rtl w:val="1"/>
-        </w:rPr>
-        <w:t>أضرار،</w:t>
-      </w:r>
-      <w:r>
-        <w:rPr>
-          <w:rFonts w:ascii="Arial" w:hAnsi="Arial" w:eastAsia="Arial" w:cs="Arial"/>
-          <w:sz w:val="28"/>
-          <w:szCs w:val="28"/>
-          <w:rtl w:val="1"/>
-        </w:rPr>
-        <w:t xml:space="preserve"> أو </w:t>
-      </w:r>
-      <w:r>
-        <w:rPr>
-          <w:rFonts w:ascii="Arial" w:hAnsi="Arial" w:eastAsia="Arial" w:cs="Arial"/>
-          <w:sz w:val="28"/>
-          <w:szCs w:val="28"/>
-          <w:rtl w:val="1"/>
-        </w:rPr>
-        <w:t>خسائر،</w:t>
-      </w:r>
-      <w:r>
-        <w:rPr>
-          <w:rFonts w:ascii="Arial" w:hAnsi="Arial" w:eastAsia="Arial" w:cs="Arial"/>
-          <w:sz w:val="28"/>
-          <w:szCs w:val="28"/>
-          <w:rtl w:val="1"/>
-        </w:rPr>
-        <w:t xml:space="preserve"> أو </w:t>
-      </w:r>
-      <w:r>
-        <w:rPr>
-          <w:rFonts w:ascii="Arial" w:hAnsi="Arial" w:eastAsia="Arial" w:cs="Arial"/>
-          <w:sz w:val="28"/>
-          <w:szCs w:val="28"/>
-          <w:rtl w:val="1"/>
-        </w:rPr>
-        <w:t>مطالبات قضائية، أو</w:t>
-      </w:r>
-      <w:r>
-        <w:rPr>
-          <w:rFonts w:ascii="Arial" w:hAnsi="Arial" w:eastAsia="Arial" w:cs="Arial"/>
-          <w:sz w:val="28"/>
-          <w:szCs w:val="28"/>
-          <w:rtl w:val="1"/>
-        </w:rPr>
-        <w:t xml:space="preserve"> إدارية تنتج عن تصرفاته أو إخلاله بالتزاماته</w:t>
-      </w:r>
-      <w:r>
-        <w:rPr>
-          <w:rFonts w:ascii="Arial" w:hAnsi="Arial" w:eastAsia="Arial" w:cs="Arial"/>
-          <w:sz w:val="28"/>
-          <w:szCs w:val="28"/>
-          <w:rtl w:val="1"/>
-        </w:rPr>
-        <w:t>.</w:t>
-      </w:r>
-      <w:r>
         <w:drawing>
-          <wp:anchor distT="0" distB="0" distL="114300" distR="114300" simplePos="0" relativeHeight="251658240" behindDoc="0" locked="0" layoutInCell="1" allowOverlap="1" wp14:editId="7586EBC0" wp14:anchorId="2E5AC562">
+          <wp:anchor distT="0" distB="0" distL="114300" distR="114300" simplePos="0" relativeHeight="251658240" behindDoc="0" locked="0" layoutInCell="1" allowOverlap="1" wp14:editId="2722E20A" wp14:anchorId="2E5AC562">
             <wp:simplePos x="0" y="0"/>
             <wp:positionH relativeFrom="column">
-              <wp:posOffset>0</wp:posOffset>
+              <wp:posOffset>-76200</wp:posOffset>
             </wp:positionH>
             <wp:positionV relativeFrom="paragraph">
-              <wp:posOffset>314325</wp:posOffset>
+              <wp:posOffset>342900</wp:posOffset>
             </wp:positionV>
             <wp:extent cx="1613826" cy="731787"/>
             <wp:effectExtent l="0" t="0" r="0" b="5080"/>
@@ -3923,6 +3880,145 @@
           </wp:anchor>
         </w:drawing>
       </w:r>
+      <w:r>
+        <w:rPr>
+          <w:rFonts w:ascii="Arial" w:hAnsi="Arial" w:eastAsia="Arial" w:cs="Arial"/>
+          <w:sz w:val="28"/>
+          <w:szCs w:val="28"/>
+          <w:rtl w:val="1"/>
+        </w:rPr>
+        <w:t xml:space="preserve">يلتزم </w:t>
+      </w:r>
+      <w:r>
+        <w:rPr>
+          <w:rFonts w:ascii="Arial" w:hAnsi="Arial" w:eastAsia="Arial" w:cs="Arial"/>
+          <w:b w:val="1"/>
+          <w:bCs w:val="1"/>
+          <w:sz w:val="28"/>
+          <w:szCs w:val="28"/>
+          <w:rtl w:val="1"/>
+        </w:rPr>
+        <w:t>الطرف الثاني</w:t>
+      </w:r>
+      <w:r>
+        <w:rPr>
+          <w:rFonts w:ascii="Arial" w:hAnsi="Arial" w:eastAsia="Arial" w:cs="Arial"/>
+          <w:sz w:val="28"/>
+          <w:szCs w:val="28"/>
+          <w:rtl w:val="1"/>
+        </w:rPr>
+        <w:t xml:space="preserve"> بتعويض </w:t>
+      </w:r>
+      <w:r>
+        <w:rPr>
+          <w:rFonts w:ascii="Arial" w:hAnsi="Arial" w:eastAsia="Arial" w:cs="Arial"/>
+          <w:b w:val="1"/>
+          <w:bCs w:val="1"/>
+          <w:sz w:val="28"/>
+          <w:szCs w:val="28"/>
+          <w:rtl w:val="1"/>
+        </w:rPr>
+        <w:t>الطرف الأول</w:t>
+      </w:r>
+      <w:r>
+        <w:rPr>
+          <w:rFonts w:ascii="Arial" w:hAnsi="Arial" w:eastAsia="Arial" w:cs="Arial"/>
+          <w:sz w:val="28"/>
+          <w:szCs w:val="28"/>
+          <w:rtl w:val="1"/>
+        </w:rPr>
+        <w:t xml:space="preserve"> عن أي </w:t>
+      </w:r>
+      <w:r>
+        <w:rPr>
+          <w:rFonts w:ascii="Arial" w:hAnsi="Arial" w:eastAsia="Arial" w:cs="Arial"/>
+          <w:sz w:val="28"/>
+          <w:szCs w:val="28"/>
+          <w:rtl w:val="1"/>
+        </w:rPr>
+        <w:t>أضرار،</w:t>
+      </w:r>
+      <w:r>
+        <w:rPr>
+          <w:rFonts w:ascii="Arial" w:hAnsi="Arial" w:eastAsia="Arial" w:cs="Arial"/>
+          <w:sz w:val="28"/>
+          <w:szCs w:val="28"/>
+          <w:rtl w:val="1"/>
+        </w:rPr>
+        <w:t xml:space="preserve"> أو </w:t>
+      </w:r>
+      <w:r>
+        <w:rPr>
+          <w:rFonts w:ascii="Arial" w:hAnsi="Arial" w:eastAsia="Arial" w:cs="Arial"/>
+          <w:sz w:val="28"/>
+          <w:szCs w:val="28"/>
+          <w:rtl w:val="1"/>
+        </w:rPr>
+        <w:t>خسائر،</w:t>
+      </w:r>
+      <w:r>
+        <w:rPr>
+          <w:rFonts w:ascii="Arial" w:hAnsi="Arial" w:eastAsia="Arial" w:cs="Arial"/>
+          <w:sz w:val="28"/>
+          <w:szCs w:val="28"/>
+          <w:rtl w:val="1"/>
+        </w:rPr>
+        <w:t xml:space="preserve"> أو </w:t>
+      </w:r>
+      <w:r>
+        <w:rPr>
+          <w:rFonts w:ascii="Arial" w:hAnsi="Arial" w:eastAsia="Arial" w:cs="Arial"/>
+          <w:sz w:val="28"/>
+          <w:szCs w:val="28"/>
+          <w:rtl w:val="1"/>
+        </w:rPr>
+        <w:t>مطالبات قضائية، أو</w:t>
+      </w:r>
+      <w:r>
+        <w:rPr>
+          <w:rFonts w:ascii="Arial" w:hAnsi="Arial" w:eastAsia="Arial" w:cs="Arial"/>
+          <w:sz w:val="28"/>
+          <w:szCs w:val="28"/>
+          <w:rtl w:val="1"/>
+        </w:rPr>
+        <w:t xml:space="preserve"> إدارية تنتج عن تصرفاته أو إخلاله بالتزاماته</w:t>
+      </w:r>
+      <w:r>
+        <w:rPr>
+          <w:rFonts w:ascii="Arial" w:hAnsi="Arial" w:eastAsia="Arial" w:cs="Arial"/>
+          <w:sz w:val="28"/>
+          <w:szCs w:val="28"/>
+          <w:rtl w:val="1"/>
+        </w:rPr>
+        <w:t>.</w:t>
+      </w:r>
+    </w:p>
+    <w:p>
+      <w:pPr>
+        <w:bidi w:val="1"/>
+        <w:rPr>
+          <w:rFonts w:ascii="Arial" w:hAnsi="Arial" w:eastAsia="Arial" w:cs="Arial"/>
+        </w:rPr>
+      </w:pPr>
+      <w:r>
+        <w:rPr>
+          <w:rFonts w:ascii="Arial" w:hAnsi="Arial" w:eastAsia="Arial" w:cs="Arial"/>
+        </w:rPr>
+        <w:br w:type="page"/>
+      </w:r>
+    </w:p>
+    <w:p>
+      <w:pPr>
+        <w:pStyle w:val="Normal"/>
+        <w:bidi w:val="1"/>
+        <w:ind w:left="0"/>
+        <w:rPr>
+          <w:rFonts w:ascii="Arial" w:hAnsi="Arial" w:eastAsia="Arial" w:cs="Arial"/>
+          <w:sz w:val="28"/>
+          <w:szCs w:val="28"/>
+          <w:rtl w:val="1"/>
+        </w:rPr>
+      </w:pPr>
     </w:p>
     <w:tbl>
       <w:tblPr>
@@ -3965,7 +4061,7 @@
             </w:pPr>
             <w:r>
               <w:drawing>
-                <wp:inline wp14:editId="48A1A080" wp14:anchorId="0919128E">
+                <wp:inline wp14:editId="2D11F75A" wp14:anchorId="0919128E">
                   <wp:extent cx="2062595" cy="803564"/>
                   <wp:effectExtent l="0" t="0" r="0" b="0"/>
                   <wp:docPr id="2082314688" name="Picture 1" descr="A logo with purple letters and numbers&#10;&#10;AI-generated content may be incorrect."/>
@@ -4048,7 +4144,7 @@
             </w:pPr>
             <w:r>
               <w:drawing>
-                <wp:inline wp14:editId="36DFA481" wp14:anchorId="056C9F71">
+                <wp:inline wp14:editId="42A10B69" wp14:anchorId="056C9F71">
                   <wp:extent cx="1432560" cy="381000"/>
                   <wp:effectExtent l="0" t="0" r="0" b="0"/>
                   <wp:docPr id="411865572" name="Picture 734064909" descr="Background pattern&#10;&#10;Description automatically generated with low confidence"/>
@@ -4114,7 +4210,7 @@
             </w:pPr>
             <w:r>
               <w:drawing>
-                <wp:inline wp14:editId="04904CF9" wp14:anchorId="72681F26">
+                <wp:inline wp14:editId="443E6928" wp14:anchorId="72681F26">
                   <wp:extent cx="1905000" cy="732155"/>
                   <wp:effectExtent l="0" t="0" r="0" b="0"/>
                   <wp:docPr id="2147465302" name="Picture 1157273046" descr="Background pattern&#10;&#10;Description automatically generated with low confidence"/>
@@ -4681,6 +4777,7 @@
           <w:numId w:val="24"/>
         </w:numPr>
         <w:bidi/>
+        <w:ind/>
         <w:rPr>
           <w:rFonts w:ascii="Arial" w:hAnsi="Arial" w:eastAsia="Arial" w:cs="Arial"/>
           <w:sz w:val="26"/>
@@ -4714,18 +4811,6 @@
         </w:rPr>
         <w:t xml:space="preserve"> في حال لم يتم تحويل كامل المبلغ المستحق.</w:t>
       </w:r>
-    </w:p>
-    <w:p>
-      <w:pPr>
-        <w:bidi/>
-        <w:ind w:left="720"/>
-        <w:rPr>
-          <w:rFonts w:ascii="Arial" w:hAnsi="Arial" w:eastAsia="Arial" w:cs="Arial"/>
-          <w:sz w:val="26"/>
-          <w:szCs w:val="26"/>
-          <w:rtl w:val="1"/>
-        </w:rPr>
-      </w:pPr>
     </w:p>
     <w:p>
       <w:pPr>
@@ -4922,6 +5007,454 @@
 
 <file path=word/numbering.xml><?xml version="1.0" encoding="utf-8"?>
 <w:numbering xmlns:wpc="http://schemas.microsoft.com/office/word/2010/wordprocessingCanvas" xmlns:cx="http://schemas.microsoft.com/office/drawing/2014/chartex" xmlns:cx1="http://schemas.microsoft.com/office/drawing/2015/9/8/chartex" xmlns:cx2="http://schemas.microsoft.com/office/drawing/2015/10/21/chartex" xmlns:cx3="http://schemas.microsoft.com/office/drawing/2016/5/9/chartex" xmlns:cx4="http://schemas.microsoft.com/office/drawing/2016/5/10/chartex" xmlns:cx5="http://schemas.microsoft.com/office/drawing/2016/5/11/chartex" xmlns:cx6="http://schemas.microsoft.com/office/drawing/2016/5/12/chartex" xmlns:cx7="http://schemas.microsoft.com/office/drawing/2016/5/13/chartex" xmlns:cx8="http://schemas.microsoft.com/office/drawing/2016/5/14/chartex" xmlns:mc="http://schemas.openxmlformats.org/markup-compatibility/2006" xmlns:aink="http://schemas.microsoft.com/office/drawing/2016/ink" xmlns:am3d="http://schemas.microsoft.com/office/drawing/2017/model3d" xmlns:o="urn:schemas-microsoft-com:office:office" xmlns:oel="http://schemas.microsoft.com/office/2019/extlst" xmlns:r="http://schemas.openxmlformats.org/officeDocument/2006/relationships" xmlns:m="http://schemas.openxmlformats.org/officeDocument/2006/math" xmlns:v="urn:schemas-microsoft-com:vml" xmlns:wp14="http://schemas.microsoft.com/office/word/2010/wordprocessingDrawing" xmlns:wp="http://schemas.openxmlformats.org/drawingml/2006/wordprocessingDrawing" xmlns:w10="urn:schemas-microsoft-com:office:word" xmlns:w="http://schemas.openxmlformats.org/wordprocessingml/2006/main" xmlns:w14="http://schemas.microsoft.com/office/word/2010/wordml" xmlns:w15="http://schemas.microsoft.com/office/word/2012/wordml" xmlns:w16cex="http://schemas.microsoft.com/office/word/2018/wordml/cex" xmlns:w16cid="http://schemas.microsoft.com/office/word/2016/wordml/cid" xmlns:w16="http://schemas.microsoft.com/office/word/2018/wordml" xmlns:w16du="http://schemas.microsoft.com/office/word/2023/wordml/word16du" xmlns:w16sdtdh="http://schemas.microsoft.com/office/word/2020/wordml/sdtdatahash" xmlns:w16sdtfl="http://schemas.microsoft.com/office/word/2024/wordml/sdtformatlock" xmlns:w16se="http://schemas.microsoft.com/office/word/2015/wordml/symex" xmlns:wpg="http://schemas.microsoft.com/office/word/2010/wordprocessingGroup" xmlns:wpi="http://schemas.microsoft.com/office/word/2010/wordprocessingInk" xmlns:wne="http://schemas.microsoft.com/office/word/2006/wordml" xmlns:wps="http://schemas.microsoft.com/office/word/2010/wordprocessingShape" mc:Ignorable="w14 w15 w16se w16cid w16 w16cex w16sdtdh w16sdtfl w16du wp14">
+  <w:abstractNum xmlns:w="http://schemas.openxmlformats.org/wordprocessingml/2006/main" w:abstractNumId="27">
+    <w:nsid w:val="5f6f67fd"/>
+    <w:multiLevelType xmlns:w="http://schemas.openxmlformats.org/wordprocessingml/2006/main" w:val="hybridMultilevel"/>
+    <w:lvl xmlns:w="http://schemas.openxmlformats.org/wordprocessingml/2006/main" w:ilvl="0">
+      <w:start w:val="1"/>
+      <w:numFmt w:val="bullet"/>
+      <w:lvlText w:val=""/>
+      <w:lvlJc w:val="left"/>
+      <w:pPr>
+        <w:ind w:left="720" w:hanging="360"/>
+      </w:pPr>
+      <w:rPr>
+        <w:rFonts w:hint="default" w:ascii="Symbol" w:hAnsi="Symbol"/>
+      </w:rPr>
+    </w:lvl>
+    <w:lvl xmlns:w="http://schemas.openxmlformats.org/wordprocessingml/2006/main" w:ilvl="1">
+      <w:start w:val="1"/>
+      <w:numFmt w:val="bullet"/>
+      <w:lvlText w:val="o"/>
+      <w:lvlJc w:val="left"/>
+      <w:pPr>
+        <w:ind w:left="1440" w:hanging="360"/>
+      </w:pPr>
+      <w:rPr>
+        <w:rFonts w:hint="default" w:ascii="Courier New" w:hAnsi="Courier New"/>
+      </w:rPr>
+    </w:lvl>
+    <w:lvl xmlns:w="http://schemas.openxmlformats.org/wordprocessingml/2006/main" w:ilvl="2">
+      <w:start w:val="1"/>
+      <w:numFmt w:val="bullet"/>
+      <w:lvlText w:val=""/>
+      <w:lvlJc w:val="left"/>
+      <w:pPr>
+        <w:ind w:left="2160" w:hanging="360"/>
+      </w:pPr>
+      <w:rPr>
+        <w:rFonts w:hint="default" w:ascii="Wingdings" w:hAnsi="Wingdings"/>
+      </w:rPr>
+    </w:lvl>
+    <w:lvl xmlns:w="http://schemas.openxmlformats.org/wordprocessingml/2006/main" w:ilvl="3">
+      <w:start w:val="1"/>
+      <w:numFmt w:val="bullet"/>
+      <w:lvlText w:val=""/>
+      <w:lvlJc w:val="left"/>
+      <w:pPr>
+        <w:ind w:left="2880" w:hanging="360"/>
+      </w:pPr>
+      <w:rPr>
+        <w:rFonts w:hint="default" w:ascii="Symbol" w:hAnsi="Symbol"/>
+      </w:rPr>
+    </w:lvl>
+    <w:lvl xmlns:w="http://schemas.openxmlformats.org/wordprocessingml/2006/main" w:ilvl="4">
+      <w:start w:val="1"/>
+      <w:numFmt w:val="bullet"/>
+      <w:lvlText w:val="o"/>
+      <w:lvlJc w:val="left"/>
+      <w:pPr>
+        <w:ind w:left="3600" w:hanging="360"/>
+      </w:pPr>
+      <w:rPr>
+        <w:rFonts w:hint="default" w:ascii="Courier New" w:hAnsi="Courier New"/>
+      </w:rPr>
+    </w:lvl>
+    <w:lvl xmlns:w="http://schemas.openxmlformats.org/wordprocessingml/2006/main" w:ilvl="5">
+      <w:start w:val="1"/>
+      <w:numFmt w:val="bullet"/>
+      <w:lvlText w:val=""/>
+      <w:lvlJc w:val="left"/>
+      <w:pPr>
+        <w:ind w:left="4320" w:hanging="360"/>
+      </w:pPr>
+      <w:rPr>
+        <w:rFonts w:hint="default" w:ascii="Wingdings" w:hAnsi="Wingdings"/>
+      </w:rPr>
+    </w:lvl>
+    <w:lvl xmlns:w="http://schemas.openxmlformats.org/wordprocessingml/2006/main" w:ilvl="6">
+      <w:start w:val="1"/>
+      <w:numFmt w:val="bullet"/>
+      <w:lvlText w:val=""/>
+      <w:lvlJc w:val="left"/>
+      <w:pPr>
+        <w:ind w:left="5040" w:hanging="360"/>
+      </w:pPr>
+      <w:rPr>
+        <w:rFonts w:hint="default" w:ascii="Symbol" w:hAnsi="Symbol"/>
+      </w:rPr>
+    </w:lvl>
+    <w:lvl xmlns:w="http://schemas.openxmlformats.org/wordprocessingml/2006/main" w:ilvl="7">
+      <w:start w:val="1"/>
+      <w:numFmt w:val="bullet"/>
+      <w:lvlText w:val="o"/>
+      <w:lvlJc w:val="left"/>
+      <w:pPr>
+        <w:ind w:left="5760" w:hanging="360"/>
+      </w:pPr>
+      <w:rPr>
+        <w:rFonts w:hint="default" w:ascii="Courier New" w:hAnsi="Courier New"/>
+      </w:rPr>
+    </w:lvl>
+    <w:lvl xmlns:w="http://schemas.openxmlformats.org/wordprocessingml/2006/main" w:ilvl="8">
+      <w:start w:val="1"/>
+      <w:numFmt w:val="bullet"/>
+      <w:lvlText w:val=""/>
+      <w:lvlJc w:val="left"/>
+      <w:pPr>
+        <w:ind w:left="6480" w:hanging="360"/>
+      </w:pPr>
+      <w:rPr>
+        <w:rFonts w:hint="default" w:ascii="Wingdings" w:hAnsi="Wingdings"/>
+      </w:rPr>
+    </w:lvl>
+  </w:abstractNum>
+  <w:abstractNum xmlns:w="http://schemas.openxmlformats.org/wordprocessingml/2006/main" w:abstractNumId="26">
+    <w:nsid w:val="4baba14a"/>
+    <w:multiLevelType xmlns:w="http://schemas.openxmlformats.org/wordprocessingml/2006/main" w:val="hybridMultilevel"/>
+    <w:lvl xmlns:w="http://schemas.openxmlformats.org/wordprocessingml/2006/main" w:ilvl="0">
+      <w:start w:val="1"/>
+      <w:numFmt w:val="bullet"/>
+      <w:lvlText w:val=""/>
+      <w:lvlJc w:val="left"/>
+      <w:pPr>
+        <w:ind w:left="720" w:hanging="360"/>
+      </w:pPr>
+      <w:rPr>
+        <w:rFonts w:hint="default" w:ascii="Symbol" w:hAnsi="Symbol"/>
+      </w:rPr>
+    </w:lvl>
+    <w:lvl xmlns:w="http://schemas.openxmlformats.org/wordprocessingml/2006/main" w:ilvl="1">
+      <w:start w:val="1"/>
+      <w:numFmt w:val="bullet"/>
+      <w:lvlText w:val="o"/>
+      <w:lvlJc w:val="left"/>
+      <w:pPr>
+        <w:ind w:left="1440" w:hanging="360"/>
+      </w:pPr>
+      <w:rPr>
+        <w:rFonts w:hint="default" w:ascii="Courier New" w:hAnsi="Courier New"/>
+      </w:rPr>
+    </w:lvl>
+    <w:lvl xmlns:w="http://schemas.openxmlformats.org/wordprocessingml/2006/main" w:ilvl="2">
+      <w:start w:val="1"/>
+      <w:numFmt w:val="bullet"/>
+      <w:lvlText w:val=""/>
+      <w:lvlJc w:val="left"/>
+      <w:pPr>
+        <w:ind w:left="2160" w:hanging="360"/>
+      </w:pPr>
+      <w:rPr>
+        <w:rFonts w:hint="default" w:ascii="Wingdings" w:hAnsi="Wingdings"/>
+      </w:rPr>
+    </w:lvl>
+    <w:lvl xmlns:w="http://schemas.openxmlformats.org/wordprocessingml/2006/main" w:ilvl="3">
+      <w:start w:val="1"/>
+      <w:numFmt w:val="bullet"/>
+      <w:lvlText w:val=""/>
+      <w:lvlJc w:val="left"/>
+      <w:pPr>
+        <w:ind w:left="2880" w:hanging="360"/>
+      </w:pPr>
+      <w:rPr>
+        <w:rFonts w:hint="default" w:ascii="Symbol" w:hAnsi="Symbol"/>
+      </w:rPr>
+    </w:lvl>
+    <w:lvl xmlns:w="http://schemas.openxmlformats.org/wordprocessingml/2006/main" w:ilvl="4">
+      <w:start w:val="1"/>
+      <w:numFmt w:val="bullet"/>
+      <w:lvlText w:val="o"/>
+      <w:lvlJc w:val="left"/>
+      <w:pPr>
+        <w:ind w:left="3600" w:hanging="360"/>
+      </w:pPr>
+      <w:rPr>
+        <w:rFonts w:hint="default" w:ascii="Courier New" w:hAnsi="Courier New"/>
+      </w:rPr>
+    </w:lvl>
+    <w:lvl xmlns:w="http://schemas.openxmlformats.org/wordprocessingml/2006/main" w:ilvl="5">
+      <w:start w:val="1"/>
+      <w:numFmt w:val="bullet"/>
+      <w:lvlText w:val=""/>
+      <w:lvlJc w:val="left"/>
+      <w:pPr>
+        <w:ind w:left="4320" w:hanging="360"/>
+      </w:pPr>
+      <w:rPr>
+        <w:rFonts w:hint="default" w:ascii="Wingdings" w:hAnsi="Wingdings"/>
+      </w:rPr>
+    </w:lvl>
+    <w:lvl xmlns:w="http://schemas.openxmlformats.org/wordprocessingml/2006/main" w:ilvl="6">
+      <w:start w:val="1"/>
+      <w:numFmt w:val="bullet"/>
+      <w:lvlText w:val=""/>
+      <w:lvlJc w:val="left"/>
+      <w:pPr>
+        <w:ind w:left="5040" w:hanging="360"/>
+      </w:pPr>
+      <w:rPr>
+        <w:rFonts w:hint="default" w:ascii="Symbol" w:hAnsi="Symbol"/>
+      </w:rPr>
+    </w:lvl>
+    <w:lvl xmlns:w="http://schemas.openxmlformats.org/wordprocessingml/2006/main" w:ilvl="7">
+      <w:start w:val="1"/>
+      <w:numFmt w:val="bullet"/>
+      <w:lvlText w:val="o"/>
+      <w:lvlJc w:val="left"/>
+      <w:pPr>
+        <w:ind w:left="5760" w:hanging="360"/>
+      </w:pPr>
+      <w:rPr>
+        <w:rFonts w:hint="default" w:ascii="Courier New" w:hAnsi="Courier New"/>
+      </w:rPr>
+    </w:lvl>
+    <w:lvl xmlns:w="http://schemas.openxmlformats.org/wordprocessingml/2006/main" w:ilvl="8">
+      <w:start w:val="1"/>
+      <w:numFmt w:val="bullet"/>
+      <w:lvlText w:val=""/>
+      <w:lvlJc w:val="left"/>
+      <w:pPr>
+        <w:ind w:left="6480" w:hanging="360"/>
+      </w:pPr>
+      <w:rPr>
+        <w:rFonts w:hint="default" w:ascii="Wingdings" w:hAnsi="Wingdings"/>
+      </w:rPr>
+    </w:lvl>
+  </w:abstractNum>
+  <w:abstractNum xmlns:w="http://schemas.openxmlformats.org/wordprocessingml/2006/main" w:abstractNumId="25">
+    <w:nsid w:val="116dd9b8"/>
+    <w:multiLevelType xmlns:w="http://schemas.openxmlformats.org/wordprocessingml/2006/main" w:val="hybridMultilevel"/>
+    <w:lvl xmlns:w="http://schemas.openxmlformats.org/wordprocessingml/2006/main" w:ilvl="0">
+      <w:start w:val="1"/>
+      <w:numFmt w:val="bullet"/>
+      <w:lvlText w:val=""/>
+      <w:lvlJc w:val="left"/>
+      <w:pPr>
+        <w:ind w:left="720" w:hanging="360"/>
+      </w:pPr>
+      <w:rPr>
+        <w:rFonts w:hint="default" w:ascii="Symbol" w:hAnsi="Symbol"/>
+      </w:rPr>
+    </w:lvl>
+    <w:lvl xmlns:w="http://schemas.openxmlformats.org/wordprocessingml/2006/main" w:ilvl="1">
+      <w:start w:val="1"/>
+      <w:numFmt w:val="bullet"/>
+      <w:lvlText w:val="o"/>
+      <w:lvlJc w:val="left"/>
+      <w:pPr>
+        <w:ind w:left="1440" w:hanging="360"/>
+      </w:pPr>
+      <w:rPr>
+        <w:rFonts w:hint="default" w:ascii="Courier New" w:hAnsi="Courier New"/>
+      </w:rPr>
+    </w:lvl>
+    <w:lvl xmlns:w="http://schemas.openxmlformats.org/wordprocessingml/2006/main" w:ilvl="2">
+      <w:start w:val="1"/>
+      <w:numFmt w:val="bullet"/>
+      <w:lvlText w:val=""/>
+      <w:lvlJc w:val="left"/>
+      <w:pPr>
+        <w:ind w:left="2160" w:hanging="360"/>
+      </w:pPr>
+      <w:rPr>
+        <w:rFonts w:hint="default" w:ascii="Wingdings" w:hAnsi="Wingdings"/>
+      </w:rPr>
+    </w:lvl>
+    <w:lvl xmlns:w="http://schemas.openxmlformats.org/wordprocessingml/2006/main" w:ilvl="3">
+      <w:start w:val="1"/>
+      <w:numFmt w:val="bullet"/>
+      <w:lvlText w:val=""/>
+      <w:lvlJc w:val="left"/>
+      <w:pPr>
+        <w:ind w:left="2880" w:hanging="360"/>
+      </w:pPr>
+      <w:rPr>
+        <w:rFonts w:hint="default" w:ascii="Symbol" w:hAnsi="Symbol"/>
+      </w:rPr>
+    </w:lvl>
+    <w:lvl xmlns:w="http://schemas.openxmlformats.org/wordprocessingml/2006/main" w:ilvl="4">
+      <w:start w:val="1"/>
+      <w:numFmt w:val="bullet"/>
+      <w:lvlText w:val="o"/>
+      <w:lvlJc w:val="left"/>
+      <w:pPr>
+        <w:ind w:left="3600" w:hanging="360"/>
+      </w:pPr>
+      <w:rPr>
+        <w:rFonts w:hint="default" w:ascii="Courier New" w:hAnsi="Courier New"/>
+      </w:rPr>
+    </w:lvl>
+    <w:lvl xmlns:w="http://schemas.openxmlformats.org/wordprocessingml/2006/main" w:ilvl="5">
+      <w:start w:val="1"/>
+      <w:numFmt w:val="bullet"/>
+      <w:lvlText w:val=""/>
+      <w:lvlJc w:val="left"/>
+      <w:pPr>
+        <w:ind w:left="4320" w:hanging="360"/>
+      </w:pPr>
+      <w:rPr>
+        <w:rFonts w:hint="default" w:ascii="Wingdings" w:hAnsi="Wingdings"/>
+      </w:rPr>
+    </w:lvl>
+    <w:lvl xmlns:w="http://schemas.openxmlformats.org/wordprocessingml/2006/main" w:ilvl="6">
+      <w:start w:val="1"/>
+      <w:numFmt w:val="bullet"/>
+      <w:lvlText w:val=""/>
+      <w:lvlJc w:val="left"/>
+      <w:pPr>
+        <w:ind w:left="5040" w:hanging="360"/>
+      </w:pPr>
+      <w:rPr>
+        <w:rFonts w:hint="default" w:ascii="Symbol" w:hAnsi="Symbol"/>
+      </w:rPr>
+    </w:lvl>
+    <w:lvl xmlns:w="http://schemas.openxmlformats.org/wordprocessingml/2006/main" w:ilvl="7">
+      <w:start w:val="1"/>
+      <w:numFmt w:val="bullet"/>
+      <w:lvlText w:val="o"/>
+      <w:lvlJc w:val="left"/>
+      <w:pPr>
+        <w:ind w:left="5760" w:hanging="360"/>
+      </w:pPr>
+      <w:rPr>
+        <w:rFonts w:hint="default" w:ascii="Courier New" w:hAnsi="Courier New"/>
+      </w:rPr>
+    </w:lvl>
+    <w:lvl xmlns:w="http://schemas.openxmlformats.org/wordprocessingml/2006/main" w:ilvl="8">
+      <w:start w:val="1"/>
+      <w:numFmt w:val="bullet"/>
+      <w:lvlText w:val=""/>
+      <w:lvlJc w:val="left"/>
+      <w:pPr>
+        <w:ind w:left="6480" w:hanging="360"/>
+      </w:pPr>
+      <w:rPr>
+        <w:rFonts w:hint="default" w:ascii="Wingdings" w:hAnsi="Wingdings"/>
+      </w:rPr>
+    </w:lvl>
+  </w:abstractNum>
+  <w:abstractNum xmlns:w="http://schemas.openxmlformats.org/wordprocessingml/2006/main" w:abstractNumId="24">
+    <w:nsid w:val="1e4b0caa"/>
+    <w:multiLevelType xmlns:w="http://schemas.openxmlformats.org/wordprocessingml/2006/main" w:val="hybridMultilevel"/>
+    <w:lvl xmlns:w="http://schemas.openxmlformats.org/wordprocessingml/2006/main" w:ilvl="0">
+      <w:start w:val="1"/>
+      <w:numFmt w:val="bullet"/>
+      <w:lvlText w:val=""/>
+      <w:lvlJc w:val="left"/>
+      <w:pPr>
+        <w:ind w:left="720" w:hanging="360"/>
+      </w:pPr>
+      <w:rPr>
+        <w:rFonts w:hint="default" w:ascii="Symbol" w:hAnsi="Symbol"/>
+      </w:rPr>
+    </w:lvl>
+    <w:lvl xmlns:w="http://schemas.openxmlformats.org/wordprocessingml/2006/main" w:ilvl="1">
+      <w:start w:val="1"/>
+      <w:numFmt w:val="bullet"/>
+      <w:lvlText w:val="o"/>
+      <w:lvlJc w:val="left"/>
+      <w:pPr>
+        <w:ind w:left="1440" w:hanging="360"/>
+      </w:pPr>
+      <w:rPr>
+        <w:rFonts w:hint="default" w:ascii="Courier New" w:hAnsi="Courier New"/>
+      </w:rPr>
+    </w:lvl>
+    <w:lvl xmlns:w="http://schemas.openxmlformats.org/wordprocessingml/2006/main" w:ilvl="2">
+      <w:start w:val="1"/>
+      <w:numFmt w:val="bullet"/>
+      <w:lvlText w:val=""/>
+      <w:lvlJc w:val="left"/>
+      <w:pPr>
+        <w:ind w:left="2160" w:hanging="360"/>
+      </w:pPr>
+      <w:rPr>
+        <w:rFonts w:hint="default" w:ascii="Wingdings" w:hAnsi="Wingdings"/>
+      </w:rPr>
+    </w:lvl>
+    <w:lvl xmlns:w="http://schemas.openxmlformats.org/wordprocessingml/2006/main" w:ilvl="3">
+      <w:start w:val="1"/>
+      <w:numFmt w:val="bullet"/>
+      <w:lvlText w:val=""/>
+      <w:lvlJc w:val="left"/>
+      <w:pPr>
+        <w:ind w:left="2880" w:hanging="360"/>
+      </w:pPr>
+      <w:rPr>
+        <w:rFonts w:hint="default" w:ascii="Symbol" w:hAnsi="Symbol"/>
+      </w:rPr>
+    </w:lvl>
+    <w:lvl xmlns:w="http://schemas.openxmlformats.org/wordprocessingml/2006/main" w:ilvl="4">
+      <w:start w:val="1"/>
+      <w:numFmt w:val="bullet"/>
+      <w:lvlText w:val="o"/>
+      <w:lvlJc w:val="left"/>
+      <w:pPr>
+        <w:ind w:left="3600" w:hanging="360"/>
+      </w:pPr>
+      <w:rPr>
+        <w:rFonts w:hint="default" w:ascii="Courier New" w:hAnsi="Courier New"/>
+      </w:rPr>
+    </w:lvl>
+    <w:lvl xmlns:w="http://schemas.openxmlformats.org/wordprocessingml/2006/main" w:ilvl="5">
+      <w:start w:val="1"/>
+      <w:numFmt w:val="bullet"/>
+      <w:lvlText w:val=""/>
+      <w:lvlJc w:val="left"/>
+      <w:pPr>
+        <w:ind w:left="4320" w:hanging="360"/>
+      </w:pPr>
+      <w:rPr>
+        <w:rFonts w:hint="default" w:ascii="Wingdings" w:hAnsi="Wingdings"/>
+      </w:rPr>
+    </w:lvl>
+    <w:lvl xmlns:w="http://schemas.openxmlformats.org/wordprocessingml/2006/main" w:ilvl="6">
+      <w:start w:val="1"/>
+      <w:numFmt w:val="bullet"/>
+      <w:lvlText w:val=""/>
+      <w:lvlJc w:val="left"/>
+      <w:pPr>
+        <w:ind w:left="5040" w:hanging="360"/>
+      </w:pPr>
+      <w:rPr>
+        <w:rFonts w:hint="default" w:ascii="Symbol" w:hAnsi="Symbol"/>
+      </w:rPr>
+    </w:lvl>
+    <w:lvl xmlns:w="http://schemas.openxmlformats.org/wordprocessingml/2006/main" w:ilvl="7">
+      <w:start w:val="1"/>
+      <w:numFmt w:val="bullet"/>
+      <w:lvlText w:val="o"/>
+      <w:lvlJc w:val="left"/>
+      <w:pPr>
+        <w:ind w:left="5760" w:hanging="360"/>
+      </w:pPr>
+      <w:rPr>
+        <w:rFonts w:hint="default" w:ascii="Courier New" w:hAnsi="Courier New"/>
+      </w:rPr>
+    </w:lvl>
+    <w:lvl xmlns:w="http://schemas.openxmlformats.org/wordprocessingml/2006/main" w:ilvl="8">
+      <w:start w:val="1"/>
+      <w:numFmt w:val="bullet"/>
+      <w:lvlText w:val=""/>
+      <w:lvlJc w:val="left"/>
+      <w:pPr>
+        <w:ind w:left="6480" w:hanging="360"/>
+      </w:pPr>
+      <w:rPr>
+        <w:rFonts w:hint="default" w:ascii="Wingdings" w:hAnsi="Wingdings"/>
+      </w:rPr>
+    </w:lvl>
+  </w:abstractNum>
   <w:abstractNum w:abstractNumId="0" w15:restartNumberingAfterBreak="0">
     <w:nsid w:val="073A5AAA"/>
     <w:multiLevelType w:val="hybridMultilevel"/>
@@ -7362,6 +7895,18 @@
       </w:pPr>
     </w:lvl>
   </w:abstractNum>
+  <w:num w:numId="28">
+    <w:abstractNumId w:val="27"/>
+  </w:num>
+  <w:num w:numId="27">
+    <w:abstractNumId w:val="26"/>
+  </w:num>
+  <w:num w:numId="26">
+    <w:abstractNumId w:val="25"/>
+  </w:num>
+  <w:num w:numId="25">
+    <w:abstractNumId w:val="24"/>
+  </w:num>
   <w:num w:numId="1" w16cid:durableId="495150088">
     <w:abstractNumId w:val="9"/>
   </w:num>

</xml_diff>